<commit_message>
rozdział I + aplikacja
</commit_message>
<xml_diff>
--- a/_PRACA/praca_magisterska_sgh_v1.docx
+++ b/_PRACA/praca_magisterska_sgh_v1.docx
@@ -2730,25 +2730,7 @@
           <w:szCs w:val="24"/>
           <w:lang w:eastAsia="pl-PL"/>
         </w:rPr>
-        <w:t>Celem pracy jest zaprojektowanie i implementacja systemu klasyfikacji arytmii serca w czasie rzeczywistym, integrującego klasyczne algorytmy przetwarzania sygnałów z głębokim uczeniem maszynowym w architekturze</w:t>
-      </w:r>
-      <w:r>
-        <w:rPr>
-          <w:rFonts w:ascii="Times New Roman" w:hAnsi="Times New Roman" w:cs="Times New Roman"/>
-          <w:sz w:val="24"/>
-          <w:szCs w:val="24"/>
-          <w:lang w:eastAsia="pl-PL"/>
-        </w:rPr>
-        <w:t xml:space="preserve"> </w:t>
-      </w:r>
-      <w:r>
-        <w:rPr>
-          <w:rFonts w:ascii="Times New Roman" w:hAnsi="Times New Roman" w:cs="Times New Roman"/>
-          <w:sz w:val="24"/>
-          <w:szCs w:val="24"/>
-          <w:lang w:eastAsia="pl-PL"/>
-        </w:rPr>
-        <w:t xml:space="preserve">strumieniowej. </w:t>
+        <w:t xml:space="preserve">Celem pracy jest zaprojektowanie i implementacja systemu klasyfikacji arytmii serca w czasie rzeczywistym, integrującego klasyczne algorytmy przetwarzania sygnałów z głębokim uczeniem maszynowym w architekturze strumieniowej. </w:t>
       </w:r>
     </w:p>
     <w:p>
@@ -3175,7 +3157,7 @@
           <w:szCs w:val="24"/>
           <w:lang w:eastAsia="pl-PL"/>
         </w:rPr>
-        <w:t>. L</w:t>
+        <w:t xml:space="preserve">. </w:t>
       </w:r>
       <w:r>
         <w:rPr>
@@ -3184,86 +3166,7 @@
           <w:szCs w:val="24"/>
           <w:lang w:eastAsia="pl-PL"/>
         </w:rPr>
-        <w:t xml:space="preserve">ecz ujawniło również znaczną </w:t>
-      </w:r>
-      <w:commentRangeStart w:id="3"/>
-      <w:r>
-        <w:rPr>
-          <w:rFonts w:ascii="Times New Roman" w:hAnsi="Times New Roman" w:cs="Times New Roman"/>
-          <w:sz w:val="24"/>
-          <w:szCs w:val="24"/>
-          <w:lang w:eastAsia="pl-PL"/>
-        </w:rPr>
-        <w:t xml:space="preserve">heterogeniczność </w:t>
-      </w:r>
-      <w:commentRangeEnd w:id="3"/>
-      <w:r>
-        <w:rPr>
-          <w:rStyle w:val="Odwoaniedokomentarza"/>
-          <w:rFonts w:ascii="Times New Roman" w:hAnsi="Times New Roman" w:cs="Times New Roman"/>
-          <w:sz w:val="24"/>
-          <w:szCs w:val="24"/>
-          <w:lang w:eastAsia="pl-PL"/>
-        </w:rPr>
-        <w:commentReference w:id="3"/>
-      </w:r>
-      <w:r>
-        <w:rPr>
-          <w:rFonts w:ascii="Times New Roman" w:hAnsi="Times New Roman" w:cs="Times New Roman"/>
-          <w:sz w:val="24"/>
-          <w:szCs w:val="24"/>
-          <w:lang w:eastAsia="pl-PL"/>
-        </w:rPr>
-        <w:t>wpływu finansowego w poszczególnych krajach europejskich. Świadczeniodawcy w krajach pozbawionych specyficznych struktur refundacyjnych dla zdalnego monitorowania odnotowali spadek zysków w porównaniu z podmiotami działającymi w ugruntowanych systemach refundacji [</w:t>
-      </w:r>
-      <w:r>
-        <w:rPr>
-          <w:rFonts w:ascii="Times New Roman" w:hAnsi="Times New Roman" w:cs="Times New Roman"/>
-          <w:sz w:val="24"/>
-          <w:szCs w:val="24"/>
-          <w:lang w:eastAsia="pl-PL"/>
-        </w:rPr>
-        <w:t>7</w:t>
-      </w:r>
-      <w:r>
-        <w:rPr>
-          <w:rFonts w:ascii="Times New Roman" w:hAnsi="Times New Roman" w:cs="Times New Roman"/>
-          <w:sz w:val="24"/>
-          <w:szCs w:val="24"/>
-          <w:lang w:eastAsia="pl-PL"/>
-        </w:rPr>
-        <w:t xml:space="preserve">]. Ta ekonomiczna niejednorodność europejskich systemów opieki zdrowotnej, w połączeniu z klinicznym </w:t>
-      </w:r>
-      <w:commentRangeStart w:id="4"/>
-      <w:r>
-        <w:rPr>
-          <w:rFonts w:ascii="Times New Roman" w:hAnsi="Times New Roman" w:cs="Times New Roman"/>
-          <w:color w:val="EE0000"/>
-          <w:sz w:val="24"/>
-          <w:szCs w:val="24"/>
-          <w:lang w:eastAsia="pl-PL"/>
-        </w:rPr>
-        <w:t xml:space="preserve">imperatywem </w:t>
-      </w:r>
-      <w:commentRangeEnd w:id="4"/>
-      <w:r>
-        <w:rPr>
-          <w:rStyle w:val="Odwoaniedokomentarza"/>
-          <w:rFonts w:ascii="Times New Roman" w:hAnsi="Times New Roman" w:cs="Times New Roman"/>
-          <w:sz w:val="24"/>
-          <w:szCs w:val="24"/>
-          <w:lang w:eastAsia="pl-PL"/>
-        </w:rPr>
-        <w:commentReference w:id="4"/>
-      </w:r>
-      <w:r>
-        <w:rPr>
-          <w:rFonts w:ascii="Times New Roman" w:hAnsi="Times New Roman" w:cs="Times New Roman"/>
-          <w:sz w:val="24"/>
-          <w:szCs w:val="24"/>
-          <w:lang w:eastAsia="pl-PL"/>
-        </w:rPr>
-        <w:t>dokładnego wykrywania arytmii, podkreśla pilną potrzebę innowacji technologicznych zdolnych do optymalizacji zarówno precyzji diagnostycznej, jak i wykorzystania zasobów w monitorowaniu serca.</w:t>
+        <w:t>Analiza wykazała istotne zróżnicowanie pod względem skutków finansowych w poszczególnych krajach europejskich. Świadczeniodawcy w państwach pozbawionych dedykowanych mechanizmów refundacji zdalnego monitorowania odnotowali spadek rentowności w porównaniu z podmiotami funkcjonującymi w ramach ugruntowanych systemów rozliczeń [7]. Ta ekonomiczna niespójność, zestawiona z medyczną koniecznością precyzyjnego diagnozowania arytmii, wskazuje na pilną potrzebę wdrażania innowacji technologicznych. Nowoczesne rozwiązania powinny pozwalać na jednoczesne zwiększenie dokładności diagnostycznej oraz optymalizację wykorzystania zasobów w nadzorze kardiologicznym.</w:t>
       </w:r>
     </w:p>
     <w:p>
@@ -3519,14 +3422,14 @@
       <w:pPr>
         <w:pStyle w:val="Nagwek2"/>
       </w:pPr>
-      <w:bookmarkStart w:id="5" w:name="_Toc226901288"/>
+      <w:bookmarkStart w:id="3" w:name="_Toc226901288"/>
       <w:r>
         <w:t xml:space="preserve">Rola </w:t>
       </w:r>
       <w:r>
         <w:t>sztucznej inteligencji w medycynie</w:t>
       </w:r>
-      <w:bookmarkEnd w:id="5"/>
+      <w:bookmarkEnd w:id="3"/>
     </w:p>
     <w:p>
       <w:pPr>
@@ -3833,14 +3736,14 @@
       <w:pPr>
         <w:pStyle w:val="Nagwek2"/>
       </w:pPr>
-      <w:bookmarkStart w:id="6" w:name="_Toc226901289"/>
+      <w:bookmarkStart w:id="4" w:name="_Toc226901289"/>
       <w:r>
         <w:t>P</w:t>
       </w:r>
       <w:r>
         <w:t>owstawaniu sygnału EKG</w:t>
       </w:r>
-      <w:bookmarkEnd w:id="6"/>
+      <w:bookmarkEnd w:id="4"/>
       <w:r>
         <w:t xml:space="preserve">  </w:t>
       </w:r>
@@ -3861,7 +3764,7 @@
           <w:sz w:val="24"/>
           <w:szCs w:val="24"/>
         </w:rPr>
-        <w:t>Aby właściwie interpretować wyniki modeli uczenia maszynowego, konieczne jest zrozumienie fizjologicznego mechanizmu powstawania zapisu elektrokardiograficznego. Serce nie jest jedynie pompą mechaniczną, ale precyzyjnym układem elektromechanicznym, w którym impuls elektryczny poprzedza każdy skurcz mięśnia.</w:t>
+        <w:t>Właściwa interpretacja wyników modeli uczenia maszynowego wymaga zrozumienia fizjologicznych mechanizmów powstawania zapisu elektrokardiograficznego. Serce stanowi precyzyjny układ elektromechaniczny, w którym impuls elektryczny poprzedza każdy skurcz mięśnia. Zjawisko to można koncepcyjnie ująć jako zależne od czasu źródło dipolowe (tzw. wektor serca), którego rzut na osie poszczególnych odprowadzeń tworzy charakterystyczne załamki rejestrowane na powierzchni ciała [11]. Każde uderzenie serca inicjowane jest przez sygnał elektryczny przemieszczający się przez układ bodźcoprzewodzący (Rysunek 2.1), co zapewnia sekwencyjny skurcz jam serca i efektywny transport krwi.</w:t>
       </w:r>
     </w:p>
     <w:p>
@@ -3872,9 +3775,41 @@
           <w:rFonts w:ascii="Times New Roman" w:hAnsi="Times New Roman" w:cs="Times New Roman"/>
           <w:sz w:val="24"/>
           <w:szCs w:val="24"/>
+        </w:rPr>
+      </w:pPr>
+      <w:r>
+        <w:rPr>
+          <w:rFonts w:ascii="Times New Roman" w:hAnsi="Times New Roman" w:cs="Times New Roman"/>
+          <w:sz w:val="24"/>
+          <w:szCs w:val="24"/>
+        </w:rPr>
+        <w:t>Proces ten rozpoczyna się depolaryzacją w węźle zatokowo-przedsionkowym (SA), skąd impuls przekazywany jest</w:t>
+      </w:r>
+      <w:r>
+        <w:rPr>
+          <w:rFonts w:ascii="Times New Roman" w:hAnsi="Times New Roman" w:cs="Times New Roman"/>
+          <w:sz w:val="24"/>
+          <w:szCs w:val="24"/>
           <w:lang w:eastAsia="pl-PL"/>
         </w:rPr>
-      </w:pPr>
+        <w:t xml:space="preserve"> między lewym, a prawym przedsionkiem </w:t>
+      </w:r>
+      <w:r>
+        <w:rPr>
+          <w:rFonts w:ascii="Times New Roman" w:hAnsi="Times New Roman" w:cs="Times New Roman"/>
+          <w:sz w:val="24"/>
+          <w:szCs w:val="24"/>
+        </w:rPr>
+        <w:t>oraz przez szlaki międzywęzłowe do węzła przedsionkowo-komorowego (AV) [12, 13]. Węzeł AV pełni funkcję zapasowego generatora rytmu</w:t>
+      </w:r>
+      <w:r>
+        <w:rPr>
+          <w:rFonts w:ascii="Times New Roman" w:hAnsi="Times New Roman" w:cs="Times New Roman"/>
+          <w:sz w:val="24"/>
+          <w:szCs w:val="24"/>
+        </w:rPr>
+        <w:t xml:space="preserve">, </w:t>
+      </w:r>
       <w:r>
         <w:rPr>
           <w:rFonts w:ascii="Times New Roman" w:hAnsi="Times New Roman" w:cs="Times New Roman"/>
@@ -3882,7 +3817,7 @@
           <w:szCs w:val="24"/>
           <w:lang w:eastAsia="pl-PL"/>
         </w:rPr>
-        <w:t>Elektrokardiogram wywodzi się z aktywności elektrycznej serca, którą można koncepcyjnie ująć jako zależne od czasu źródło dipolowe reprezentowane przez wektor</w:t>
+        <w:t>ze względu na jego zdolności bodźcotwórcze</w:t>
       </w:r>
       <w:r>
         <w:rPr>
@@ -3891,7 +3826,7 @@
           <w:szCs w:val="24"/>
           <w:lang w:eastAsia="pl-PL"/>
         </w:rPr>
-        <w:t xml:space="preserve">, </w:t>
+        <w:t xml:space="preserve">. Jednak </w:t>
       </w:r>
       <w:r>
         <w:rPr>
@@ -3900,7 +3835,39 @@
           <w:szCs w:val="24"/>
           <w:lang w:eastAsia="pl-PL"/>
         </w:rPr>
-        <w:t>tzw. wektor serca</w:t>
+        <w:t>przez jego</w:t>
+      </w:r>
+      <w:r>
+        <w:rPr>
+          <w:rFonts w:ascii="Times New Roman" w:hAnsi="Times New Roman" w:cs="Times New Roman"/>
+          <w:sz w:val="24"/>
+          <w:szCs w:val="24"/>
+        </w:rPr>
+        <w:t xml:space="preserve"> niską prędkość przewodzenia (ok. 0,01–0,05 m/s), wprowadza on kluczowe opóźnienie między skurczem przedsionków a komór, co pozwala na ich optymalne napełnienie krwią [13]. Następnie pobudzenie trafia do pęczka Hisa, dzielącego się na prawą i lewą odnogę, a finalnie przez włókna Purkinjego do ścian komór, inicjując ich skurcz i wyrzut krwi do krążenia systemowego oraz płucnego [</w:t>
+      </w:r>
+      <w:r>
+        <w:rPr>
+          <w:rFonts w:ascii="Times New Roman" w:hAnsi="Times New Roman" w:cs="Times New Roman"/>
+          <w:sz w:val="24"/>
+          <w:szCs w:val="24"/>
+        </w:rPr>
+        <w:t>12][</w:t>
+      </w:r>
+      <w:r>
+        <w:rPr>
+          <w:rFonts w:ascii="Times New Roman" w:hAnsi="Times New Roman" w:cs="Times New Roman"/>
+          <w:sz w:val="24"/>
+          <w:szCs w:val="24"/>
+        </w:rPr>
+        <w:t>14].</w:t>
+      </w:r>
+      <w:r>
+        <w:rPr>
+          <w:rFonts w:ascii="Times New Roman" w:hAnsi="Times New Roman" w:cs="Times New Roman"/>
+          <w:sz w:val="24"/>
+          <w:szCs w:val="24"/>
+        </w:rPr>
+        <w:t xml:space="preserve"> </w:t>
       </w:r>
       <w:r>
         <w:rPr>
@@ -3909,7 +3876,7 @@
           <w:szCs w:val="24"/>
           <w:lang w:eastAsia="pl-PL"/>
         </w:rPr>
-        <w:t xml:space="preserve">, </w:t>
+        <w:t>Skurcz lewej komory serca powoduje wyrzut krwi natlenowanej do aorty, skurcz prawej - krew odtlenowaną do tętnicy płucnej [</w:t>
       </w:r>
       <w:r>
         <w:rPr>
@@ -3918,7 +3885,7 @@
           <w:szCs w:val="24"/>
           <w:lang w:eastAsia="pl-PL"/>
         </w:rPr>
-        <w:t xml:space="preserve"> którego rzut na osie poszczególnych odprowadzeń tworzy charakterystyczne załamki rejestrowane na powierzchni ciała [</w:t>
+        <w:t>14</w:t>
       </w:r>
       <w:r>
         <w:rPr>
@@ -3927,52 +3894,7 @@
           <w:szCs w:val="24"/>
           <w:lang w:eastAsia="pl-PL"/>
         </w:rPr>
-        <w:t>11</w:t>
-      </w:r>
-      <w:r>
-        <w:rPr>
-          <w:rFonts w:ascii="Times New Roman" w:hAnsi="Times New Roman" w:cs="Times New Roman"/>
-          <w:sz w:val="24"/>
-          <w:szCs w:val="24"/>
-          <w:lang w:eastAsia="pl-PL"/>
-        </w:rPr>
         <w:t xml:space="preserve">]. </w:t>
-      </w:r>
-      <w:r>
-        <w:rPr>
-          <w:rFonts w:ascii="Times New Roman" w:hAnsi="Times New Roman" w:cs="Times New Roman"/>
-          <w:sz w:val="24"/>
-          <w:szCs w:val="24"/>
-          <w:lang w:eastAsia="pl-PL"/>
-        </w:rPr>
-        <w:t>Inaczej mówiąc k</w:t>
-      </w:r>
-      <w:r>
-        <w:rPr>
-          <w:rFonts w:ascii="Times New Roman" w:hAnsi="Times New Roman" w:cs="Times New Roman"/>
-          <w:sz w:val="24"/>
-          <w:szCs w:val="24"/>
-          <w:lang w:eastAsia="pl-PL"/>
-        </w:rPr>
-        <w:t>ażde uderzenie serca jest inicjowane przez sygnał elektryczny, który przemieszcza się przez układ bodźcoprzewodzący</w:t>
-      </w:r>
-      <w:r>
-        <w:rPr>
-          <w:rFonts w:ascii="Times New Roman" w:hAnsi="Times New Roman" w:cs="Times New Roman"/>
-          <w:sz w:val="24"/>
-          <w:szCs w:val="24"/>
-          <w:lang w:eastAsia="pl-PL"/>
-        </w:rPr>
-        <w:t xml:space="preserve"> (Rysunek 2.1)</w:t>
-      </w:r>
-      <w:r>
-        <w:rPr>
-          <w:rFonts w:ascii="Times New Roman" w:hAnsi="Times New Roman" w:cs="Times New Roman"/>
-          <w:sz w:val="24"/>
-          <w:szCs w:val="24"/>
-          <w:lang w:eastAsia="pl-PL"/>
-        </w:rPr>
-        <w:t xml:space="preserve">, wyzwalając skurcz czterech jam serca w odpowiedniej sekwencji i zapewniając efektywne pompowanie krwi []. </w:t>
       </w:r>
     </w:p>
     <w:p>
@@ -3986,178 +3908,18 @@
           <w:lang w:eastAsia="pl-PL"/>
         </w:rPr>
       </w:pPr>
-      <w:commentRangeStart w:id="7"/>
-      <w:r>
-        <w:rPr>
-          <w:rFonts w:ascii="Times New Roman" w:hAnsi="Times New Roman" w:cs="Times New Roman"/>
+      <w:r>
+        <w:rPr>
+          <w:rFonts w:ascii="Times New Roman" w:hAnsi="Times New Roman" w:cs="Times New Roman"/>
+          <w:noProof/>
           <w:sz w:val="24"/>
           <w:szCs w:val="24"/>
           <w:lang w:eastAsia="pl-PL"/>
         </w:rPr>
-        <w:t>Pobudzenie elektryczne każdego cyklu sercowego rozpoczyna się od depolaryzacji w prawym przedsionku w węźle zatokowo-przedsionkowym [1</w:t>
-      </w:r>
-      <w:r>
-        <w:rPr>
-          <w:rFonts w:ascii="Times New Roman" w:hAnsi="Times New Roman" w:cs="Times New Roman"/>
-          <w:sz w:val="24"/>
-          <w:szCs w:val="24"/>
-          <w:lang w:eastAsia="pl-PL"/>
-        </w:rPr>
-        <w:t>2</w:t>
-      </w:r>
-      <w:r>
-        <w:rPr>
-          <w:rFonts w:ascii="Times New Roman" w:hAnsi="Times New Roman" w:cs="Times New Roman"/>
-          <w:sz w:val="24"/>
-          <w:szCs w:val="24"/>
-          <w:lang w:eastAsia="pl-PL"/>
-        </w:rPr>
-        <w:t>]. Przez szlak międzyprzedsionkowy impuls przekazywany jest między lewym, a prawym przedsionkiem [</w:t>
-      </w:r>
-      <w:r>
-        <w:rPr>
-          <w:rFonts w:ascii="Times New Roman" w:hAnsi="Times New Roman" w:cs="Times New Roman"/>
-          <w:sz w:val="24"/>
-          <w:szCs w:val="24"/>
-          <w:lang w:eastAsia="pl-PL"/>
-        </w:rPr>
-        <w:t>13</w:t>
-      </w:r>
-      <w:r>
-        <w:rPr>
-          <w:rFonts w:ascii="Times New Roman" w:hAnsi="Times New Roman" w:cs="Times New Roman"/>
-          <w:sz w:val="24"/>
-          <w:szCs w:val="24"/>
-          <w:lang w:eastAsia="pl-PL"/>
-        </w:rPr>
-        <w:t>]. Następnie pobudzenie przewodzone jest przez szlak międzywęzłowy przedni do węzła przedsionkowo-komorowego. Węzeł ten nazywany jest zapasowym generatorem rytmu, ze względu na jego zdolności bodźcotwórcze, jednak przekazuje impuls z o wiele mniejszą prędkością 50-100mm/s, powodując opóźnienie miedzy skurczem przedsionków, a skurczem komór [</w:t>
-      </w:r>
-      <w:r>
-        <w:rPr>
-          <w:rFonts w:ascii="Times New Roman" w:hAnsi="Times New Roman" w:cs="Times New Roman"/>
-          <w:sz w:val="24"/>
-          <w:szCs w:val="24"/>
-          <w:lang w:eastAsia="pl-PL"/>
-        </w:rPr>
-        <w:t>13</w:t>
-      </w:r>
-      <w:r>
-        <w:rPr>
-          <w:rFonts w:ascii="Times New Roman" w:hAnsi="Times New Roman" w:cs="Times New Roman"/>
-          <w:sz w:val="24"/>
-          <w:szCs w:val="24"/>
-          <w:lang w:eastAsia="pl-PL"/>
-        </w:rPr>
-        <w:t>]. Z węzła przedsionkowo komorowego impuls przekazywany jest do pęczka Hisa, który rozdziela się na prawą i lewą odnogę [1</w:t>
-      </w:r>
-      <w:r>
-        <w:rPr>
-          <w:rFonts w:ascii="Times New Roman" w:hAnsi="Times New Roman" w:cs="Times New Roman"/>
-          <w:sz w:val="24"/>
-          <w:szCs w:val="24"/>
-          <w:lang w:eastAsia="pl-PL"/>
-        </w:rPr>
-        <w:t>2</w:t>
-      </w:r>
-      <w:r>
-        <w:rPr>
-          <w:rFonts w:ascii="Times New Roman" w:hAnsi="Times New Roman" w:cs="Times New Roman"/>
-          <w:sz w:val="24"/>
-          <w:szCs w:val="24"/>
-          <w:lang w:eastAsia="pl-PL"/>
-        </w:rPr>
-        <w:t xml:space="preserve">]. Lewa odnoga dzieli się na dwie wiązki – przednią i tylną. </w:t>
-      </w:r>
-      <w:r>
-        <w:rPr>
-          <w:rFonts w:ascii="Times New Roman" w:hAnsi="Times New Roman" w:cs="Times New Roman"/>
-          <w:sz w:val="24"/>
-          <w:szCs w:val="24"/>
-          <w:lang w:eastAsia="pl-PL"/>
-        </w:rPr>
-        <w:t>K</w:t>
-      </w:r>
-      <w:r>
-        <w:rPr>
-          <w:rFonts w:ascii="Times New Roman" w:hAnsi="Times New Roman" w:cs="Times New Roman"/>
-          <w:sz w:val="24"/>
-          <w:szCs w:val="24"/>
-          <w:lang w:eastAsia="pl-PL"/>
-        </w:rPr>
-        <w:t>ontaktują się z komórkami Purkinjego, którego włókna odpowiedzialne są za rozprowadzenie impulsu w ścianach komór. Skurcz lewej komory serca powoduje wyrzut krwi natlenowanej do aorty, skurcz prawej - krew odtlenowaną do tętnicy płucnej. [</w:t>
-      </w:r>
-      <w:r>
-        <w:rPr>
-          <w:rFonts w:ascii="Times New Roman" w:hAnsi="Times New Roman" w:cs="Times New Roman"/>
-          <w:sz w:val="24"/>
-          <w:szCs w:val="24"/>
-          <w:lang w:eastAsia="pl-PL"/>
-        </w:rPr>
-        <w:t>14</w:t>
-      </w:r>
-      <w:r>
-        <w:rPr>
-          <w:rFonts w:ascii="Times New Roman" w:hAnsi="Times New Roman" w:cs="Times New Roman"/>
-          <w:sz w:val="24"/>
-          <w:szCs w:val="24"/>
-          <w:lang w:eastAsia="pl-PL"/>
-        </w:rPr>
-        <w:t>]. Na Rys</w:t>
-      </w:r>
-      <w:r>
-        <w:rPr>
-          <w:rFonts w:ascii="Times New Roman" w:hAnsi="Times New Roman" w:cs="Times New Roman"/>
-          <w:sz w:val="24"/>
-          <w:szCs w:val="24"/>
-          <w:lang w:eastAsia="pl-PL"/>
-        </w:rPr>
-        <w:t xml:space="preserve">unku </w:t>
-      </w:r>
-      <w:r>
-        <w:rPr>
-          <w:rFonts w:ascii="Times New Roman" w:hAnsi="Times New Roman" w:cs="Times New Roman"/>
-          <w:sz w:val="24"/>
-          <w:szCs w:val="24"/>
-          <w:lang w:eastAsia="pl-PL"/>
-        </w:rPr>
-        <w:t>2.1. pokazano budowę układu bodźcotwórczo-bodźcowoprzewodzącego serca wraz z wewnątrzkomórkowymi potencjałami czynnościowymi typowymi dla poszczególnych elementów tego układu.</w:t>
-      </w:r>
-      <w:commentRangeEnd w:id="7"/>
-      <w:r>
-        <w:rPr>
-          <w:rStyle w:val="Odwoaniedokomentarza"/>
-          <w:rFonts w:ascii="Times New Roman" w:hAnsi="Times New Roman" w:cs="Times New Roman"/>
-          <w:sz w:val="24"/>
-          <w:szCs w:val="24"/>
-          <w:lang w:eastAsia="pl-PL"/>
-        </w:rPr>
-        <w:commentReference w:id="7"/>
-      </w:r>
-    </w:p>
-    <w:p>
-      <w:pPr>
-        <w:spacing w:line="360" w:lineRule="auto"/>
-        <w:jc w:val="both"/>
-        <w:rPr>
-          <w:rFonts w:ascii="Times New Roman" w:hAnsi="Times New Roman" w:cs="Times New Roman"/>
-          <w:sz w:val="24"/>
-          <w:szCs w:val="24"/>
-          <w:lang w:eastAsia="pl-PL"/>
-        </w:rPr>
-      </w:pPr>
-      <w:r>
-        <w:rPr>
-          <w:rFonts w:ascii="Times New Roman" w:hAnsi="Times New Roman" w:cs="Times New Roman"/>
-          <w:noProof/>
-          <w:sz w:val="24"/>
-          <w:szCs w:val="24"/>
-          <w:lang w:eastAsia="pl-PL"/>
-        </w:rPr>
-        <w:lastRenderedPageBreak/>
         <w:drawing>
-          <wp:inline distT="0" distB="0" distL="0" distR="0" wp14:anchorId="1AB97C0F" wp14:editId="5FCB232A">
-            <wp:extent cx="5760720" cy="3079115"/>
-            <wp:effectExtent l="0" t="0" r="0" b="6985"/>
+          <wp:inline distT="0" distB="0" distL="0" distR="0" wp14:anchorId="1AB97C0F" wp14:editId="3C276F57">
+            <wp:extent cx="4443204" cy="2374900"/>
+            <wp:effectExtent l="0" t="0" r="0" b="6350"/>
             <wp:docPr id="382965542" name="Obraz 1"/>
             <wp:cNvGraphicFramePr>
               <a:graphicFrameLocks xmlns:a="http://schemas.openxmlformats.org/drawingml/2006/main" noChangeAspect="1"/>
@@ -4170,7 +3932,7 @@
                     <pic:cNvPicPr/>
                   </pic:nvPicPr>
                   <pic:blipFill>
-                    <a:blip r:embed="rId13"/>
+                    <a:blip r:embed="rId9"/>
                     <a:stretch>
                       <a:fillRect/>
                     </a:stretch>
@@ -4178,7 +3940,7 @@
                   <pic:spPr>
                     <a:xfrm>
                       <a:off x="0" y="0"/>
-                      <a:ext cx="5760720" cy="3079115"/>
+                      <a:ext cx="4483542" cy="2396461"/>
                     </a:xfrm>
                     <a:prstGeom prst="rect">
                       <a:avLst/>
@@ -4196,56 +3958,36 @@
         <w:pStyle w:val="Legenda"/>
         <w:jc w:val="center"/>
       </w:pPr>
-      <w:bookmarkStart w:id="8" w:name="_Toc226896381"/>
+      <w:bookmarkStart w:id="5" w:name="_Toc226896381"/>
       <w:r>
         <w:t xml:space="preserve">Rysunek </w:t>
       </w:r>
-      <w:r>
-        <w:fldChar w:fldCharType="begin"/>
-      </w:r>
-      <w:r>
-        <w:instrText xml:space="preserve"> STYLEREF 1 \s </w:instrText>
-      </w:r>
-      <w:r>
-        <w:fldChar w:fldCharType="separate"/>
-      </w:r>
-      <w:r>
-        <w:rPr>
-          <w:noProof/>
-        </w:rPr>
-        <w:t>2</w:t>
-      </w:r>
-      <w:r>
-        <w:fldChar w:fldCharType="end"/>
-      </w:r>
+      <w:fldSimple w:instr=" STYLEREF 1 \s ">
+        <w:r>
+          <w:rPr>
+            <w:noProof/>
+          </w:rPr>
+          <w:t>2</w:t>
+        </w:r>
+      </w:fldSimple>
       <w:r>
         <w:noBreakHyphen/>
       </w:r>
-      <w:r>
-        <w:fldChar w:fldCharType="begin"/>
-      </w:r>
-      <w:r>
-        <w:instrText xml:space="preserve"> SEQ Rysunek \* ARABIC \s 1 </w:instrText>
-      </w:r>
-      <w:r>
-        <w:fldChar w:fldCharType="separate"/>
-      </w:r>
-      <w:r>
-        <w:rPr>
-          <w:noProof/>
-        </w:rPr>
-        <w:t>1</w:t>
-      </w:r>
-      <w:r>
-        <w:fldChar w:fldCharType="end"/>
-      </w:r>
+      <w:fldSimple w:instr=" SEQ Rysunek \* ARABIC \s 1 ">
+        <w:r>
+          <w:rPr>
+            <w:noProof/>
+          </w:rPr>
+          <w:t>1</w:t>
+        </w:r>
+      </w:fldSimple>
       <w:r>
         <w:t xml:space="preserve"> </w:t>
       </w:r>
       <w:r>
         <w:t>Układ bodźcowoprzewodzący serca. Źródło: https://clinmedjournals.org/articles/ijpr/international journal-of-pediatric-research-ijpr-9-104.php?jid=ijpr</w:t>
       </w:r>
-      <w:bookmarkEnd w:id="8"/>
+      <w:bookmarkEnd w:id="5"/>
     </w:p>
     <w:p>
       <w:pPr>
@@ -4253,6 +3995,7 @@
         <w:jc w:val="center"/>
       </w:pPr>
       <w:r>
+        <w:lastRenderedPageBreak/>
         <w:t>Tłumaczenia: SA (Sinoatrial) node – węzęł zatokowo-przedsionkowy; Artial muscle – mięsień przedsionków; AV (Atrioventricular) node – węzęł przedsionkowo-komorowy; Common bundle – pęczek Hisa; Bundle bran ches – odnogi pęczka; Purkinje fibers – włókna Purkinjego; Ventricular muscle – mięsień komór; Left posteriori fascicle – wiązka tylnej lewej odnogi; Purkinje system – włókna Purkinjego; Right bundle branch – prawa od noga pęczka Hisa; Budle of His – pęczek Hisa; Internodal pathways – drogi międzywęzłowe; Superior vena cava – żyła główna górna. Źródlo: W. F. Ganong: Podstawy fizjologii lekarskiej, PZWL, Warszawa, 2009</w:t>
       </w:r>
     </w:p>
@@ -4270,18 +4013,15 @@
           <w:rFonts w:ascii="Times New Roman" w:hAnsi="Times New Roman" w:cs="Times New Roman"/>
           <w:sz w:val="24"/>
           <w:szCs w:val="24"/>
-          <w:lang w:eastAsia="pl-PL"/>
-        </w:rPr>
-      </w:pPr>
-      <w:commentRangeStart w:id="9"/>
-      <w:r>
-        <w:rPr>
-          <w:rFonts w:ascii="Times New Roman" w:hAnsi="Times New Roman" w:cs="Times New Roman"/>
-          <w:sz w:val="24"/>
-          <w:szCs w:val="24"/>
-          <w:lang w:eastAsia="pl-PL"/>
-        </w:rPr>
-        <w:t>Te fizjologiczne podstawy generowania sygnału EKG stanowią fundament zarówno dla tradycyjnej interpretacji wizualnej, jak i nowoczesnych metod uczenia maszynowego, ponieważ algorytmy ML uczą się rozpoznawać w tych sygnałach wzorce korelujące ze specyficznymi patologiami, wariantami normy oraz markerami prognostycznymi. Zrozumienie elektrofizjologicznego pochodzenia zapisu EKG jest niezbędne do opracowania solidnych systemów klasyfikacji ML, które będą w stanie precyzyjnie odróżnić istotne klinicznie znaleziska od artefaktów i naturalnych zmienności w zastosowaniach monitorowania w czasie rzeczywistym.</w:t>
+        </w:rPr>
+      </w:pPr>
+      <w:r>
+        <w:rPr>
+          <w:rFonts w:ascii="Times New Roman" w:hAnsi="Times New Roman" w:cs="Times New Roman"/>
+          <w:sz w:val="24"/>
+          <w:szCs w:val="24"/>
+        </w:rPr>
+        <w:t>Opisane podstawy elektrofizjologiczne stanowią fundament zarówno dla tradycyjnej diagnostyki, jak i nowoczesnych metod uczenia maszynowego (ML). Algorytmy te uczą się rozpoznawać wzorce korelujące ze specyficznymi patologiami, wariantami normy oraz markerami prognostycznymi. Zrozumienie pochodzenia sygnału jest niezbędne do budowy solidnych systemów klasyfikacji, zdolnych do odróżnienia istotnych klinicznie zmian od naturalnej zmienności osobniczej.</w:t>
       </w:r>
     </w:p>
     <w:p>
@@ -4300,7 +4040,23 @@
           <w:sz w:val="24"/>
           <w:szCs w:val="24"/>
         </w:rPr>
-        <w:t>Z punktu widzenia analizy danych Big Data, EKG jest quasi-okresowym szeregiem czasowym. Każda odchyłka od wzorcowego kształtu fali (np. brak załamka lub rozszerzony zespół ) niesie ze sobą informację o konkretnej patologii.</w:t>
+        <w:t>Z perspektywy analizy danych, EKG reprezentuje quasi-okresowy szereg czasowy. Każda odchyłka od wzorcowej morfologii fali</w:t>
+      </w:r>
+      <w:r>
+        <w:rPr>
+          <w:rFonts w:ascii="Times New Roman" w:hAnsi="Times New Roman" w:cs="Times New Roman"/>
+          <w:sz w:val="24"/>
+          <w:szCs w:val="24"/>
+        </w:rPr>
+        <w:t xml:space="preserve">, </w:t>
+      </w:r>
+      <w:r>
+        <w:rPr>
+          <w:rFonts w:ascii="Times New Roman" w:hAnsi="Times New Roman" w:cs="Times New Roman"/>
+          <w:sz w:val="24"/>
+          <w:szCs w:val="24"/>
+        </w:rPr>
+        <w:t>taka jak brak załamka P czy poszerzenie zespołu QRS</w:t>
       </w:r>
       <w:r>
         <w:rPr>
@@ -4316,53 +4072,8 @@
           <w:sz w:val="24"/>
           <w:szCs w:val="24"/>
         </w:rPr>
-        <w:t xml:space="preserve">Dla systemów czasu rzeczywistego największym wyzwaniem nie jest sama interpretacja "czystego" sygnału, ale odróżnienie go od szumów (np. zakłóceń z sieci energetycznej lub artefaktów ruchowych pacjenta), które mogą generować fałszywe alarmy. </w:t>
-      </w:r>
-      <w:r>
-        <w:rPr>
-          <w:rFonts w:ascii="Times New Roman" w:hAnsi="Times New Roman" w:cs="Times New Roman"/>
-          <w:sz w:val="24"/>
-          <w:szCs w:val="24"/>
-        </w:rPr>
-        <w:t>P</w:t>
-      </w:r>
-      <w:r>
-        <w:rPr>
-          <w:rFonts w:ascii="Times New Roman" w:hAnsi="Times New Roman" w:cs="Times New Roman"/>
-          <w:sz w:val="24"/>
-          <w:szCs w:val="24"/>
-        </w:rPr>
-        <w:t xml:space="preserve">recyzyjne odczytanie tych impulsów przez algorytm ML pozwala na </w:t>
-      </w:r>
-      <w:r>
-        <w:rPr>
-          <w:rFonts w:ascii="Times New Roman" w:hAnsi="Times New Roman" w:cs="Times New Roman"/>
-          <w:sz w:val="24"/>
-          <w:szCs w:val="24"/>
-        </w:rPr>
-        <w:lastRenderedPageBreak/>
-        <w:t>bezinwazyjne monitorowanie pacjenta bez konieczności angażowania kosztownej aparatury klinicznej w każdym przypadku.</w:t>
-      </w:r>
-      <w:commentRangeEnd w:id="9"/>
-      <w:r>
-        <w:rPr>
-          <w:rStyle w:val="Odwoaniedokomentarza"/>
-          <w:rFonts w:ascii="Times New Roman" w:hAnsi="Times New Roman" w:cs="Times New Roman"/>
-          <w:sz w:val="24"/>
-          <w:szCs w:val="24"/>
-        </w:rPr>
-        <w:commentReference w:id="9"/>
-      </w:r>
-    </w:p>
-    <w:p>
-      <w:pPr>
-        <w:pStyle w:val="Nagwek1"/>
-      </w:pPr>
-      <w:bookmarkStart w:id="10" w:name="_Toc226901290"/>
-      <w:r>
-        <w:t>Architektura systemu i metodologia badań</w:t>
-      </w:r>
-      <w:bookmarkEnd w:id="10"/>
+        <w:t>niesie kluczową informację o konkretnej patologii. W systemach monitorowania w czasie rzeczywistym największym wyzwaniem pozostaje jednak odróżnienie sygnału biologicznego od szumów (np. zakłóceń sieciowych czy artefaktów ruchowych). Precyzyjna ekstrakcja cech przez modele ML pozwala na nieinwazyjny nadzór nad pacjentem, minimalizując liczbę fałszywych alarmów i optymalizując wykorzystanie aparatury klinicznej.</w:t>
+      </w:r>
     </w:p>
     <w:p>
       <w:pPr>
@@ -4374,88 +4085,16 @@
           <w:szCs w:val="24"/>
         </w:rPr>
       </w:pPr>
-      <w:r>
-        <w:rPr>
-          <w:rFonts w:ascii="Times New Roman" w:hAnsi="Times New Roman" w:cs="Times New Roman"/>
-          <w:sz w:val="24"/>
-          <w:szCs w:val="24"/>
-        </w:rPr>
-        <w:t xml:space="preserve">Realizacja systemu klasyfikacji sygnału EKG w czasie rzeczywistym wymaga zaprojektowania skalowalnej infrastruktury zdolnej do obsługi strumieni danych o wysokiej częstotliwości próbkowania. </w:t>
-      </w:r>
-      <w:r>
-        <w:rPr>
-          <w:rFonts w:ascii="Times New Roman" w:hAnsi="Times New Roman" w:cs="Times New Roman"/>
-          <w:sz w:val="24"/>
-          <w:szCs w:val="24"/>
-        </w:rPr>
-        <w:t>Przyjęte rozwiązanie architektoniczne</w:t>
-      </w:r>
-      <w:r>
-        <w:rPr>
-          <w:rFonts w:ascii="Times New Roman" w:hAnsi="Times New Roman" w:cs="Times New Roman"/>
-          <w:sz w:val="24"/>
-          <w:szCs w:val="24"/>
-        </w:rPr>
-        <w:t xml:space="preserve"> </w:t>
-      </w:r>
-      <w:r>
-        <w:rPr>
-          <w:rFonts w:ascii="Times New Roman" w:hAnsi="Times New Roman" w:cs="Times New Roman"/>
-          <w:sz w:val="24"/>
-          <w:szCs w:val="24"/>
-        </w:rPr>
-        <w:t>opiera się na separacji trzech warstw funkcjonalnych: warstwy pozyskiwania danych (producent), warstwy transmisji i</w:t>
-      </w:r>
-      <w:r>
-        <w:rPr>
-          <w:rFonts w:ascii="Times New Roman" w:hAnsi="Times New Roman" w:cs="Times New Roman"/>
-          <w:sz w:val="24"/>
-          <w:szCs w:val="24"/>
-        </w:rPr>
-        <w:t xml:space="preserve"> </w:t>
-      </w:r>
-      <w:r>
-        <w:rPr>
-          <w:rFonts w:ascii="Times New Roman" w:hAnsi="Times New Roman" w:cs="Times New Roman"/>
-          <w:sz w:val="24"/>
-          <w:szCs w:val="24"/>
-        </w:rPr>
-        <w:t>buforowania (broker komunikatów) oraz warstwy analitycznej (konsument z modelem ML). W niniejszym rozdziale opisano</w:t>
-      </w:r>
-      <w:r>
-        <w:rPr>
-          <w:rFonts w:ascii="Times New Roman" w:hAnsi="Times New Roman" w:cs="Times New Roman"/>
-          <w:sz w:val="24"/>
-          <w:szCs w:val="24"/>
-        </w:rPr>
-        <w:t xml:space="preserve"> </w:t>
-      </w:r>
-      <w:r>
-        <w:rPr>
-          <w:rFonts w:ascii="Times New Roman" w:hAnsi="Times New Roman" w:cs="Times New Roman"/>
-          <w:sz w:val="24"/>
-          <w:szCs w:val="24"/>
-        </w:rPr>
-        <w:t>fundamenty danych, dobór technologii oraz logikę przepływu informacji w zaprojektowanym potoku przetwarzania</w:t>
-      </w:r>
-      <w:r>
-        <w:rPr>
-          <w:rFonts w:ascii="Times New Roman" w:hAnsi="Times New Roman" w:cs="Times New Roman"/>
-          <w:sz w:val="24"/>
-          <w:szCs w:val="24"/>
-        </w:rPr>
-        <w:t>.</w:t>
-      </w:r>
-    </w:p>
-    <w:p>
-      <w:pPr>
-        <w:pStyle w:val="Nagwek2"/>
-      </w:pPr>
-      <w:bookmarkStart w:id="11" w:name="_Toc226901291"/>
-      <w:r>
-        <w:t>Źródło danych</w:t>
-      </w:r>
-      <w:bookmarkEnd w:id="11"/>
+    </w:p>
+    <w:p>
+      <w:pPr>
+        <w:pStyle w:val="Nagwek1"/>
+      </w:pPr>
+      <w:bookmarkStart w:id="6" w:name="_Toc226901290"/>
+      <w:r>
+        <w:t>Architektura systemu i metodologia badań</w:t>
+      </w:r>
+      <w:bookmarkEnd w:id="6"/>
     </w:p>
     <w:p>
       <w:pPr>
@@ -4473,6 +4112,99 @@
           <w:sz w:val="24"/>
           <w:szCs w:val="24"/>
         </w:rPr>
+        <w:t xml:space="preserve">Realizacja systemu klasyfikacji sygnału EKG w czasie rzeczywistym wymaga zaprojektowania skalowalnej infrastruktury zdolnej do obsługi strumieni danych o wysokiej częstotliwości próbkowania. </w:t>
+      </w:r>
+      <w:r>
+        <w:rPr>
+          <w:rFonts w:ascii="Times New Roman" w:hAnsi="Times New Roman" w:cs="Times New Roman"/>
+          <w:sz w:val="24"/>
+          <w:szCs w:val="24"/>
+        </w:rPr>
+        <w:t>Przyjęte rozwiązanie architektoniczne</w:t>
+      </w:r>
+      <w:r>
+        <w:rPr>
+          <w:rFonts w:ascii="Times New Roman" w:hAnsi="Times New Roman" w:cs="Times New Roman"/>
+          <w:sz w:val="24"/>
+          <w:szCs w:val="24"/>
+        </w:rPr>
+        <w:t xml:space="preserve"> </w:t>
+      </w:r>
+      <w:r>
+        <w:rPr>
+          <w:rFonts w:ascii="Times New Roman" w:hAnsi="Times New Roman" w:cs="Times New Roman"/>
+          <w:sz w:val="24"/>
+          <w:szCs w:val="24"/>
+        </w:rPr>
+        <w:t>opiera się na separacji trzech warstw funkcjonalnych: warstwy pozyskiwania danych (producent), warstwy transmisji i</w:t>
+      </w:r>
+      <w:r>
+        <w:rPr>
+          <w:rFonts w:ascii="Times New Roman" w:hAnsi="Times New Roman" w:cs="Times New Roman"/>
+          <w:sz w:val="24"/>
+          <w:szCs w:val="24"/>
+        </w:rPr>
+        <w:t xml:space="preserve"> </w:t>
+      </w:r>
+      <w:r>
+        <w:rPr>
+          <w:rFonts w:ascii="Times New Roman" w:hAnsi="Times New Roman" w:cs="Times New Roman"/>
+          <w:sz w:val="24"/>
+          <w:szCs w:val="24"/>
+        </w:rPr>
+        <w:t>buforowania (broker komunikatów) oraz warstwy analitycznej (konsument z modelem ML). W niniejszym rozdziale opisano</w:t>
+      </w:r>
+      <w:r>
+        <w:rPr>
+          <w:rFonts w:ascii="Times New Roman" w:hAnsi="Times New Roman" w:cs="Times New Roman"/>
+          <w:sz w:val="24"/>
+          <w:szCs w:val="24"/>
+        </w:rPr>
+        <w:t xml:space="preserve"> </w:t>
+      </w:r>
+      <w:r>
+        <w:rPr>
+          <w:rFonts w:ascii="Times New Roman" w:hAnsi="Times New Roman" w:cs="Times New Roman"/>
+          <w:sz w:val="24"/>
+          <w:szCs w:val="24"/>
+        </w:rPr>
+        <w:t>fundamenty danych, dobór technologii oraz logikę przepływu informacji w zaprojektowanym potoku przetwarzania</w:t>
+      </w:r>
+      <w:r>
+        <w:rPr>
+          <w:rFonts w:ascii="Times New Roman" w:hAnsi="Times New Roman" w:cs="Times New Roman"/>
+          <w:sz w:val="24"/>
+          <w:szCs w:val="24"/>
+        </w:rPr>
+        <w:t>.</w:t>
+      </w:r>
+    </w:p>
+    <w:p>
+      <w:pPr>
+        <w:pStyle w:val="Nagwek2"/>
+      </w:pPr>
+      <w:bookmarkStart w:id="7" w:name="_Toc226901291"/>
+      <w:r>
+        <w:t>Źródło danych</w:t>
+      </w:r>
+      <w:bookmarkEnd w:id="7"/>
+    </w:p>
+    <w:p>
+      <w:pPr>
+        <w:spacing w:line="360" w:lineRule="auto"/>
+        <w:jc w:val="both"/>
+        <w:rPr>
+          <w:rFonts w:ascii="Times New Roman" w:hAnsi="Times New Roman" w:cs="Times New Roman"/>
+          <w:sz w:val="24"/>
+          <w:szCs w:val="24"/>
+        </w:rPr>
+      </w:pPr>
+      <w:r>
+        <w:rPr>
+          <w:rFonts w:ascii="Times New Roman" w:hAnsi="Times New Roman" w:cs="Times New Roman"/>
+          <w:sz w:val="24"/>
+          <w:szCs w:val="24"/>
+        </w:rPr>
         <w:t>Podstawą procesu uczenia i testowania modeli jest</w:t>
       </w:r>
       <w:r>
@@ -4580,7 +4312,16 @@
           <w:sz w:val="24"/>
           <w:szCs w:val="24"/>
         </w:rPr>
-        <w:t xml:space="preserve"> zawiera 48 zapisów, z których każdy obejmuje dwukanałowe sygnały EKG o czasie trwania 30 minut, wyselekcjonowane z 24-godzinnych nagrań pochodzących od 47 osób</w:t>
+        <w:t xml:space="preserve"> zawiera 48 zapisów, z których każdy obejmuje </w:t>
+      </w:r>
+      <w:r>
+        <w:rPr>
+          <w:rFonts w:ascii="Times New Roman" w:hAnsi="Times New Roman" w:cs="Times New Roman"/>
+          <w:sz w:val="24"/>
+          <w:szCs w:val="24"/>
+        </w:rPr>
+        <w:lastRenderedPageBreak/>
+        <w:t>dwukanałowe sygnały EKG o czasie trwania 30 minut, wyselekcjonowane z 24-godzinnych nagrań pochodzących od 47 osób</w:t>
       </w:r>
       <w:r>
         <w:rPr>
@@ -4723,11 +4464,11 @@
       <w:pPr>
         <w:pStyle w:val="Nagwek2"/>
       </w:pPr>
-      <w:bookmarkStart w:id="12" w:name="_Toc226901292"/>
+      <w:bookmarkStart w:id="8" w:name="_Toc226901292"/>
       <w:r>
         <w:t>Technologia</w:t>
       </w:r>
-      <w:bookmarkEnd w:id="12"/>
+      <w:bookmarkEnd w:id="8"/>
     </w:p>
     <w:p>
       <w:pPr>
@@ -4881,16 +4622,14 @@
           <w:rFonts w:ascii="Times New Roman" w:hAnsi="Times New Roman" w:cs="Times New Roman"/>
           <w:sz w:val="24"/>
           <w:szCs w:val="24"/>
-          <w:lang w:val="en-US"/>
-        </w:rPr>
-      </w:pPr>
-      <w:r>
-        <w:rPr>
-          <w:rFonts w:ascii="Times New Roman" w:hAnsi="Times New Roman" w:cs="Times New Roman"/>
-          <w:sz w:val="24"/>
-          <w:szCs w:val="24"/>
-        </w:rPr>
-        <w:lastRenderedPageBreak/>
+        </w:rPr>
+      </w:pPr>
+      <w:r>
+        <w:rPr>
+          <w:rFonts w:ascii="Times New Roman" w:hAnsi="Times New Roman" w:cs="Times New Roman"/>
+          <w:sz w:val="24"/>
+          <w:szCs w:val="24"/>
+        </w:rPr>
         <w:t>Apache Kafka: Pełni rolę rozproszonego brokera komunikatów. Odpowiada za buforowanie strumienia EKG, eliminując ryzyko utraty danych przy chwilowych przeciążeniach procesora.</w:t>
       </w:r>
       <w:r>
@@ -4899,31 +4638,7 @@
           <w:sz w:val="24"/>
           <w:szCs w:val="24"/>
         </w:rPr>
-        <w:t xml:space="preserve"> W</w:t>
-      </w:r>
-      <w:r>
-        <w:rPr>
-          <w:rFonts w:ascii="Times New Roman" w:hAnsi="Times New Roman" w:cs="Times New Roman"/>
-          <w:sz w:val="24"/>
-          <w:szCs w:val="24"/>
-        </w:rPr>
-        <w:t xml:space="preserve"> przypadku chwilowego przeciążenia</w:t>
-      </w:r>
-      <w:r>
-        <w:rPr>
-          <w:rFonts w:ascii="Times New Roman" w:hAnsi="Times New Roman" w:cs="Times New Roman"/>
-          <w:sz w:val="24"/>
-          <w:szCs w:val="24"/>
-        </w:rPr>
-        <w:t xml:space="preserve">, </w:t>
-      </w:r>
-      <w:r>
-        <w:rPr>
-          <w:rFonts w:ascii="Times New Roman" w:hAnsi="Times New Roman" w:cs="Times New Roman"/>
-          <w:sz w:val="24"/>
-          <w:szCs w:val="24"/>
-        </w:rPr>
-        <w:t>podczas inferencji modelu, próbki nie są tracone, lecz</w:t>
+        <w:t xml:space="preserve"> W przypadku chwilowego przeciążenia, podczas inferencji modelu, próbki nie są tracone, lecz</w:t>
       </w:r>
       <w:r>
         <w:rPr>
@@ -4955,31 +4670,7 @@
           <w:sz w:val="24"/>
           <w:szCs w:val="24"/>
         </w:rPr>
-        <w:t xml:space="preserve"> D</w:t>
-      </w:r>
-      <w:r>
-        <w:rPr>
-          <w:rFonts w:ascii="Times New Roman" w:hAnsi="Times New Roman" w:cs="Times New Roman"/>
-          <w:sz w:val="24"/>
-          <w:szCs w:val="24"/>
-        </w:rPr>
-        <w:t>ziałający w modelu publish–subscribe. Producent publikuje próbki EKG do</w:t>
-      </w:r>
-      <w:r>
-        <w:rPr>
-          <w:rFonts w:ascii="Times New Roman" w:hAnsi="Times New Roman" w:cs="Times New Roman"/>
-          <w:sz w:val="24"/>
-          <w:szCs w:val="24"/>
-        </w:rPr>
-        <w:t xml:space="preserve"> </w:t>
-      </w:r>
-      <w:r>
-        <w:rPr>
-          <w:rFonts w:ascii="Times New Roman" w:hAnsi="Times New Roman" w:cs="Times New Roman"/>
-          <w:sz w:val="24"/>
-          <w:szCs w:val="24"/>
-        </w:rPr>
-        <w:t xml:space="preserve">dedykowanego topiku (ecg-stream), skąd konsument odczytuje je asynchronicznie. </w:t>
+        <w:t xml:space="preserve"> Działający w modelu publish–subscribe. Producent publikuje próbki EKG do dedykowanego topiku (ecg-stream), skąd konsument odczytuje je asynchronicznie. </w:t>
       </w:r>
     </w:p>
     <w:p>
@@ -5149,6 +4840,14 @@
           <w:sz w:val="24"/>
           <w:szCs w:val="24"/>
         </w:rPr>
+        <w:t xml:space="preserve"> </w:t>
+      </w:r>
+      <w:r>
+        <w:rPr>
+          <w:rFonts w:ascii="Times New Roman" w:hAnsi="Times New Roman" w:cs="Times New Roman"/>
+          <w:sz w:val="24"/>
+          <w:szCs w:val="24"/>
+        </w:rPr>
         <w:t>operacje na sygnałach (filtracja, FFT),</w:t>
       </w:r>
     </w:p>
@@ -5242,7 +4941,7 @@
         </w:rPr>
         <w:t xml:space="preserve">Logiczny przepływ danych w systemie przebiega </w:t>
       </w:r>
-      <w:commentRangeStart w:id="13"/>
+      <w:commentRangeStart w:id="9"/>
       <w:r>
         <w:rPr>
           <w:rFonts w:ascii="Times New Roman" w:hAnsi="Times New Roman" w:cs="Times New Roman"/>
@@ -5251,7 +4950,7 @@
         </w:rPr>
         <w:t>następująco</w:t>
       </w:r>
-      <w:commentRangeEnd w:id="13"/>
+      <w:commentRangeEnd w:id="9"/>
       <w:r>
         <w:rPr>
           <w:rStyle w:val="Odwoaniedokomentarza"/>
@@ -5259,7 +4958,7 @@
           <w:sz w:val="24"/>
           <w:szCs w:val="24"/>
         </w:rPr>
-        <w:commentReference w:id="13"/>
+        <w:commentReference w:id="9"/>
       </w:r>
       <w:r>
         <w:rPr>
@@ -5315,6 +5014,7 @@
           <w:sz w:val="24"/>
           <w:szCs w:val="24"/>
         </w:rPr>
+        <w:lastRenderedPageBreak/>
         <w:t>Struktura kodu została podzielona na moduły realizujące specyficzne zadania:</w:t>
       </w:r>
     </w:p>
@@ -5408,11 +5108,11 @@
       <w:pPr>
         <w:pStyle w:val="Nagwek2"/>
       </w:pPr>
-      <w:bookmarkStart w:id="14" w:name="_Toc226901293"/>
+      <w:bookmarkStart w:id="10" w:name="_Toc226901293"/>
       <w:r>
         <w:t>Projekt potoku przetwarzania</w:t>
       </w:r>
-      <w:bookmarkEnd w:id="14"/>
+      <w:bookmarkEnd w:id="10"/>
     </w:p>
     <w:p>
       <w:pPr>
@@ -5469,8 +5169,70 @@
           <w:sz w:val="24"/>
           <w:szCs w:val="24"/>
         </w:rPr>
-        <w:t xml:space="preserve">Etap I </w:t>
-      </w:r>
+        <w:t>Etap I Ingestia i filtracja wstępna.</w:t>
+      </w:r>
+    </w:p>
+    <w:p>
+      <w:pPr>
+        <w:spacing w:line="360" w:lineRule="auto"/>
+        <w:jc w:val="both"/>
+        <w:rPr>
+          <w:rFonts w:ascii="Times New Roman" w:hAnsi="Times New Roman" w:cs="Times New Roman"/>
+          <w:sz w:val="24"/>
+          <w:szCs w:val="24"/>
+        </w:rPr>
+      </w:pPr>
+      <w:r>
+        <w:rPr>
+          <w:rFonts w:ascii="Times New Roman" w:hAnsi="Times New Roman" w:cs="Times New Roman"/>
+          <w:sz w:val="24"/>
+          <w:szCs w:val="24"/>
+        </w:rPr>
+        <w:t>Producent odczytuje próbki z pliku MIT-BIH i przekazuje je do Kafki z tempem</w:t>
+      </w:r>
+      <w:r>
+        <w:rPr>
+          <w:rFonts w:ascii="Times New Roman" w:hAnsi="Times New Roman" w:cs="Times New Roman"/>
+          <w:sz w:val="24"/>
+          <w:szCs w:val="24"/>
+        </w:rPr>
+        <w:t xml:space="preserve"> </w:t>
+      </w:r>
+      <w:r>
+        <w:rPr>
+          <w:rFonts w:ascii="Times New Roman" w:hAnsi="Times New Roman" w:cs="Times New Roman"/>
+          <w:sz w:val="24"/>
+          <w:szCs w:val="24"/>
+        </w:rPr>
+        <w:t>odpowiadającym rzeczywistej częstotliwości próbkowania (1/360 s ≈ 2,78 ms na próbkę), symulując transmisję z  urządzenia holterowskiego. Konsument buforuje napływające próbki w oknie kołowym o długości 8 sekund (2880 próbek), co stanowi minimalny zasób sygnału wymagany do stabilnej detekcji QRS. Filtracja artefaktów sieciowych i ruchowych</w:t>
+      </w:r>
+      <w:r>
+        <w:rPr>
+          <w:rFonts w:ascii="Times New Roman" w:hAnsi="Times New Roman" w:cs="Times New Roman"/>
+          <w:sz w:val="24"/>
+          <w:szCs w:val="24"/>
+        </w:rPr>
+        <w:t xml:space="preserve"> </w:t>
+      </w:r>
+      <w:r>
+        <w:rPr>
+          <w:rFonts w:ascii="Times New Roman" w:hAnsi="Times New Roman" w:cs="Times New Roman"/>
+          <w:sz w:val="24"/>
+          <w:szCs w:val="24"/>
+        </w:rPr>
+        <w:t>realizowana jest w ramach algorytmu Pan-Tompkinsa na etapie detekcji (rozdział 4.1).</w:t>
+      </w:r>
+    </w:p>
+    <w:p>
+      <w:pPr>
+        <w:spacing w:line="360" w:lineRule="auto"/>
+        <w:jc w:val="both"/>
+        <w:rPr>
+          <w:rFonts w:ascii="Times New Roman" w:hAnsi="Times New Roman" w:cs="Times New Roman"/>
+          <w:sz w:val="24"/>
+          <w:szCs w:val="24"/>
+        </w:rPr>
+      </w:pPr>
       <w:r>
         <w:rPr>
           <w:rFonts w:ascii="Times New Roman" w:hAnsi="Times New Roman" w:cs="Times New Roman"/>
@@ -5479,7 +5241,15 @@
           <w:sz w:val="24"/>
           <w:szCs w:val="24"/>
         </w:rPr>
-        <w:t>Ingestia i filtracja wstępna.</w:t>
+        <w:t>Etap 2 Detekcja zespołów QRS</w:t>
+      </w:r>
+      <w:r>
+        <w:rPr>
+          <w:rFonts w:ascii="Times New Roman" w:hAnsi="Times New Roman" w:cs="Times New Roman"/>
+          <w:sz w:val="24"/>
+          <w:szCs w:val="24"/>
+        </w:rPr>
+        <w:t xml:space="preserve">. </w:t>
       </w:r>
     </w:p>
     <w:p>
@@ -5498,8 +5268,7 @@
           <w:sz w:val="24"/>
           <w:szCs w:val="24"/>
         </w:rPr>
-        <w:lastRenderedPageBreak/>
-        <w:t>Producent odczytuje próbki z pliku MIT-BIH i przekazuje je do Kafki z tempem</w:t>
+        <w:t>Co 50 napływających próbek (co ~139 ms) konsument uruchamia algorytm Pan-Tompkinsa na</w:t>
       </w:r>
       <w:r>
         <w:rPr>
@@ -5515,23 +5284,7 @@
           <w:sz w:val="24"/>
           <w:szCs w:val="24"/>
         </w:rPr>
-        <w:t>odpowiadającym rzeczywistej częstotliwości próbkowania (1/360 s ≈ 2,78 ms na próbkę), symulując transmisję z  urządzenia holterowskiego. Konsument buforuje napływające próbki w oknie kołowym o długości 8 sekund (2880 próbek), co stanowi minimalny zasób sygnału wymagany do stabilnej detekcji QRS. Filtracja artefaktów sieciowych i ruchowych</w:t>
-      </w:r>
-      <w:r>
-        <w:rPr>
-          <w:rFonts w:ascii="Times New Roman" w:hAnsi="Times New Roman" w:cs="Times New Roman"/>
-          <w:sz w:val="24"/>
-          <w:szCs w:val="24"/>
-        </w:rPr>
-        <w:t xml:space="preserve"> </w:t>
-      </w:r>
-      <w:r>
-        <w:rPr>
-          <w:rFonts w:ascii="Times New Roman" w:hAnsi="Times New Roman" w:cs="Times New Roman"/>
-          <w:sz w:val="24"/>
-          <w:szCs w:val="24"/>
-        </w:rPr>
-        <w:t>realizowana jest w ramach algorytmu Pan-Tompkinsa na etapie detekcji (patrz rozdział 4.1).</w:t>
+        <w:t>aktualnym buforze sygnału. Algorytm ten, poprzez sekwencję filtracji pasmowoprzepustowej, różniczkowania, kwadratowania i całkowania ruchomym oknem, lokalizuje położenia załamków R z dokładnością pojedynczej próbki.  Szczegółowy opis algorytmu zawarty jest w rozdziale 4.1.</w:t>
       </w:r>
     </w:p>
     <w:p>
@@ -5540,20 +5293,12 @@
         <w:jc w:val="both"/>
         <w:rPr>
           <w:rFonts w:ascii="Times New Roman" w:hAnsi="Times New Roman" w:cs="Times New Roman"/>
-          <w:sz w:val="24"/>
-          <w:szCs w:val="24"/>
-        </w:rPr>
-      </w:pPr>
-      <w:r>
-        <w:rPr>
-          <w:rFonts w:ascii="Times New Roman" w:hAnsi="Times New Roman" w:cs="Times New Roman"/>
           <w:b/>
           <w:bCs/>
           <w:sz w:val="24"/>
           <w:szCs w:val="24"/>
         </w:rPr>
-        <w:t>Etap 2</w:t>
-      </w:r>
+      </w:pPr>
       <w:r>
         <w:rPr>
           <w:rFonts w:ascii="Times New Roman" w:hAnsi="Times New Roman" w:cs="Times New Roman"/>
@@ -5562,9 +5307,57 @@
           <w:sz w:val="24"/>
           <w:szCs w:val="24"/>
         </w:rPr>
+        <w:t xml:space="preserve">Etap 3  Segmentacja. </w:t>
+      </w:r>
+    </w:p>
+    <w:p>
+      <w:pPr>
+        <w:spacing w:line="360" w:lineRule="auto"/>
+        <w:jc w:val="both"/>
+        <w:rPr>
+          <w:rFonts w:ascii="Times New Roman" w:hAnsi="Times New Roman" w:cs="Times New Roman"/>
+          <w:sz w:val="24"/>
+          <w:szCs w:val="24"/>
+        </w:rPr>
+      </w:pPr>
+      <w:r>
+        <w:rPr>
+          <w:rFonts w:ascii="Times New Roman" w:hAnsi="Times New Roman" w:cs="Times New Roman"/>
+          <w:sz w:val="24"/>
+          <w:szCs w:val="24"/>
+        </w:rPr>
+        <w:t xml:space="preserve">Wokół każdego wykrytego załamka R wycinane jest okno o długości 360 próbek (1 sekunda przy fs = 360 Hz), wyśrodkowane na szczycie R (180 próbek przed i 180 po). Rozmiar okna </w:t>
+      </w:r>
+      <w:r>
+        <w:rPr>
+          <w:rFonts w:ascii="Times New Roman" w:hAnsi="Times New Roman" w:cs="Times New Roman"/>
+          <w:sz w:val="24"/>
+          <w:szCs w:val="24"/>
+        </w:rPr>
+        <w:lastRenderedPageBreak/>
+        <w:t>jest spójny z rozmiarem użytym podczas</w:t>
+      </w:r>
+      <w:r>
+        <w:rPr>
+          <w:rFonts w:ascii="Times New Roman" w:hAnsi="Times New Roman" w:cs="Times New Roman"/>
+          <w:sz w:val="24"/>
+          <w:szCs w:val="24"/>
+        </w:rPr>
         <w:t xml:space="preserve"> </w:t>
       </w:r>
       <w:r>
+        <w:rPr>
+          <w:rFonts w:ascii="Times New Roman" w:hAnsi="Times New Roman" w:cs="Times New Roman"/>
+          <w:sz w:val="24"/>
+          <w:szCs w:val="24"/>
+        </w:rPr>
+        <w:t>treningu modelu i obejmuje pełny cykl sercowy: falę P, zespół QRS oraz odcinek ST z falą T. Piki wykryte w odległości  mniejszej niż 300 ms od poprzednio sklasyfikowanego pobudzenia są pomijane (okres refrakcji), co eliminuje podwójne  klasyfikacje jednego uderzenia.</w:t>
+      </w:r>
+    </w:p>
+    <w:p>
+      <w:pPr>
+        <w:spacing w:line="360" w:lineRule="auto"/>
+        <w:jc w:val="both"/>
         <w:rPr>
           <w:rFonts w:ascii="Times New Roman" w:hAnsi="Times New Roman" w:cs="Times New Roman"/>
           <w:b/>
@@ -5572,15 +5365,16 @@
           <w:sz w:val="24"/>
           <w:szCs w:val="24"/>
         </w:rPr>
-        <w:t>Detekcja zespołów QRS</w:t>
-      </w:r>
-      <w:r>
-        <w:rPr>
-          <w:rFonts w:ascii="Times New Roman" w:hAnsi="Times New Roman" w:cs="Times New Roman"/>
-          <w:sz w:val="24"/>
-          <w:szCs w:val="24"/>
-        </w:rPr>
-        <w:t xml:space="preserve">. </w:t>
+      </w:pPr>
+      <w:r>
+        <w:rPr>
+          <w:rFonts w:ascii="Times New Roman" w:hAnsi="Times New Roman" w:cs="Times New Roman"/>
+          <w:b/>
+          <w:bCs/>
+          <w:sz w:val="24"/>
+          <w:szCs w:val="24"/>
+        </w:rPr>
+        <w:t xml:space="preserve">Etap 4 Inferencja modelu ML. </w:t>
       </w:r>
     </w:p>
     <w:p>
@@ -5599,24 +5393,47 @@
           <w:sz w:val="24"/>
           <w:szCs w:val="24"/>
         </w:rPr>
-        <w:t>Co 50 napływających próbek (co ~139 ms) konsument uruchamia algorytm Pan-Tompkinsa na</w:t>
-      </w:r>
-      <w:r>
-        <w:rPr>
-          <w:rFonts w:ascii="Times New Roman" w:hAnsi="Times New Roman" w:cs="Times New Roman"/>
-          <w:sz w:val="24"/>
-          <w:szCs w:val="24"/>
-        </w:rPr>
+        <w:t xml:space="preserve">Wycięte okno normalizowane jest statystykami Z-score wyznaczonymi na zbiorze  treningowym DS1, a następnie przekazywane do modelu sieci neuronowej. Model zwraca wektor prawdopodobieństw dla 5 klas   AAMI; klasa z najwyższym prawdopodobieństwem stanowi wynik klasyfikacji. Wynik wraz z wartością pewności modelu  przekazywany jest do modułu wizualizacji, gdzie oznaczany jest kolorystycznie na bieżącym wykresie EKG (zielony   klasa N, czerwony </w:t>
+      </w:r>
+      <w:r>
+        <w:rPr>
+          <w:rFonts w:ascii="Times New Roman" w:hAnsi="Times New Roman" w:cs="Times New Roman"/>
+          <w:sz w:val="24"/>
+          <w:szCs w:val="24"/>
+        </w:rPr>
+        <w:t>to</w:t>
+      </w:r>
+      <w:r>
+        <w:rPr>
+          <w:rFonts w:ascii="Times New Roman" w:hAnsi="Times New Roman" w:cs="Times New Roman"/>
+          <w:sz w:val="24"/>
+          <w:szCs w:val="24"/>
+        </w:rPr>
+        <w:t xml:space="preserve"> pozostałe klasy).</w:t>
+      </w:r>
+    </w:p>
+    <w:p>
+      <w:pPr>
+        <w:pStyle w:val="Nagwek1"/>
+      </w:pPr>
+      <w:bookmarkStart w:id="11" w:name="_Toc226901294"/>
+      <w:r>
+        <w:t>Implementacja i uczenie modelu</w:t>
+      </w:r>
+      <w:bookmarkEnd w:id="11"/>
+      <w:r>
         <w:t xml:space="preserve"> </w:t>
       </w:r>
-      <w:r>
-        <w:rPr>
-          <w:rFonts w:ascii="Times New Roman" w:hAnsi="Times New Roman" w:cs="Times New Roman"/>
-          <w:sz w:val="24"/>
-          <w:szCs w:val="24"/>
-        </w:rPr>
-        <w:t>aktualnym buforze sygnału. Algorytm ten, poprzez sekwencję filtracji pasmowoprzepustowej, różniczkowania,  kwadratowania i całkowania ruchomym oknem, lokalizuje położenia załamków R z dokładnością pojedynczej próbki.  Szczegółowy opis algorytmu zawarty jest w rozdziale 4.1.</w:t>
-      </w:r>
+    </w:p>
+    <w:p>
+      <w:pPr>
+        <w:pStyle w:val="Nagwek2"/>
+      </w:pPr>
+      <w:bookmarkStart w:id="12" w:name="_Toc226901295"/>
+      <w:r>
+        <w:t>Pre-processing i segmentacja danych treningowych</w:t>
+      </w:r>
+      <w:bookmarkEnd w:id="12"/>
     </w:p>
     <w:p>
       <w:pPr>
@@ -5624,172 +5441,17 @@
         <w:jc w:val="both"/>
         <w:rPr>
           <w:rFonts w:ascii="Times New Roman" w:hAnsi="Times New Roman" w:cs="Times New Roman"/>
-          <w:b/>
-          <w:bCs/>
-          <w:sz w:val="24"/>
-          <w:szCs w:val="24"/>
-        </w:rPr>
-      </w:pPr>
-      <w:r>
-        <w:rPr>
-          <w:rFonts w:ascii="Times New Roman" w:hAnsi="Times New Roman" w:cs="Times New Roman"/>
-          <w:b/>
-          <w:bCs/>
-          <w:sz w:val="24"/>
-          <w:szCs w:val="24"/>
-        </w:rPr>
-        <w:t xml:space="preserve">Etap 3  Segmentacja. </w:t>
-      </w:r>
-    </w:p>
-    <w:p>
-      <w:pPr>
-        <w:spacing w:line="360" w:lineRule="auto"/>
-        <w:jc w:val="both"/>
-        <w:rPr>
-          <w:rFonts w:ascii="Times New Roman" w:hAnsi="Times New Roman" w:cs="Times New Roman"/>
-          <w:sz w:val="24"/>
-          <w:szCs w:val="24"/>
-        </w:rPr>
-      </w:pPr>
-      <w:r>
-        <w:rPr>
-          <w:rFonts w:ascii="Times New Roman" w:hAnsi="Times New Roman" w:cs="Times New Roman"/>
-          <w:sz w:val="24"/>
-          <w:szCs w:val="24"/>
-        </w:rPr>
-        <w:t>Wokół każdego wykrytego załamka R wycinane jest okno o długości 360 próbek (1 sekunda przy fs = 360 Hz), wyśrodkowane na szczycie R (180 próbek przed i 180 po). Rozmiar okna jest spójny z rozmiarem użytym podczas</w:t>
-      </w:r>
-      <w:r>
-        <w:rPr>
-          <w:rFonts w:ascii="Times New Roman" w:hAnsi="Times New Roman" w:cs="Times New Roman"/>
-          <w:sz w:val="24"/>
-          <w:szCs w:val="24"/>
-        </w:rPr>
-        <w:t xml:space="preserve"> </w:t>
-      </w:r>
-      <w:r>
-        <w:rPr>
-          <w:rFonts w:ascii="Times New Roman" w:hAnsi="Times New Roman" w:cs="Times New Roman"/>
-          <w:sz w:val="24"/>
-          <w:szCs w:val="24"/>
-        </w:rPr>
-        <w:t>treningu modelu i obejmuje pełny cykl sercowy: falę P, zespół QRS oraz odcinek ST z falą T. Piki wykryte w odległości  mniejszej niż 300 ms od poprzednio sklasyfikowanego pobudzenia są pomijane (okres refrakcji), co eliminuje podwójne  klasyfikacje jednego uderzenia.</w:t>
-      </w:r>
-    </w:p>
-    <w:p>
-      <w:pPr>
-        <w:spacing w:line="360" w:lineRule="auto"/>
-        <w:jc w:val="both"/>
-        <w:rPr>
-          <w:rFonts w:ascii="Times New Roman" w:hAnsi="Times New Roman" w:cs="Times New Roman"/>
-          <w:b/>
-          <w:bCs/>
-          <w:sz w:val="24"/>
-          <w:szCs w:val="24"/>
-        </w:rPr>
-      </w:pPr>
-      <w:r>
-        <w:rPr>
-          <w:rFonts w:ascii="Times New Roman" w:hAnsi="Times New Roman" w:cs="Times New Roman"/>
-          <w:b/>
-          <w:bCs/>
-          <w:sz w:val="24"/>
-          <w:szCs w:val="24"/>
-        </w:rPr>
-        <w:t xml:space="preserve">Etap 4 Inferencja modelu ML. </w:t>
-      </w:r>
-    </w:p>
-    <w:p>
-      <w:pPr>
-        <w:spacing w:line="360" w:lineRule="auto"/>
-        <w:jc w:val="both"/>
-        <w:rPr>
-          <w:rFonts w:ascii="Times New Roman" w:hAnsi="Times New Roman" w:cs="Times New Roman"/>
-          <w:sz w:val="24"/>
-          <w:szCs w:val="24"/>
-        </w:rPr>
-      </w:pPr>
-      <w:r>
-        <w:rPr>
-          <w:rFonts w:ascii="Times New Roman" w:hAnsi="Times New Roman" w:cs="Times New Roman"/>
-          <w:sz w:val="24"/>
-          <w:szCs w:val="24"/>
-        </w:rPr>
-        <w:t xml:space="preserve">Wycięte okno normalizowane jest statystykami Z-score wyznaczonymi na zbiorze  treningowym DS1, a następnie przekazywane do modelu sieci neuronowej. Model zwraca wektor prawdopodobieństw dla 5 klas   AAMI; klasa z najwyższym prawdopodobieństwem stanowi wynik klasyfikacji. Wynik wraz z wartością pewności modelu  przekazywany jest do modułu wizualizacji, gdzie oznaczany jest kolorystycznie na bieżącym wykresie EKG (zielony   klasa N, czerwony </w:t>
-      </w:r>
-      <w:r>
-        <w:rPr>
-          <w:rFonts w:ascii="Times New Roman" w:hAnsi="Times New Roman" w:cs="Times New Roman"/>
-          <w:sz w:val="24"/>
-          <w:szCs w:val="24"/>
-        </w:rPr>
-        <w:t>to</w:t>
-      </w:r>
-      <w:r>
-        <w:rPr>
-          <w:rFonts w:ascii="Times New Roman" w:hAnsi="Times New Roman" w:cs="Times New Roman"/>
-          <w:sz w:val="24"/>
-          <w:szCs w:val="24"/>
-        </w:rPr>
-        <w:t xml:space="preserve"> pozostałe klasy).</w:t>
-      </w:r>
-    </w:p>
-    <w:p>
-      <w:pPr>
-        <w:pStyle w:val="Nagwek1"/>
-      </w:pPr>
-      <w:bookmarkStart w:id="15" w:name="_Toc226901294"/>
-      <w:r>
-        <w:t>Implementacja i uczenie modelu</w:t>
-      </w:r>
-      <w:bookmarkEnd w:id="15"/>
-      <w:r>
-        <w:t xml:space="preserve"> </w:t>
-      </w:r>
-    </w:p>
-    <w:p>
-      <w:pPr>
-        <w:pStyle w:val="Nagwek2"/>
-      </w:pPr>
-      <w:bookmarkStart w:id="16" w:name="_Toc226901295"/>
-      <w:r>
-        <w:t>Pre-processing i segmentacja danych treningowych</w:t>
-      </w:r>
-      <w:bookmarkEnd w:id="16"/>
-    </w:p>
-    <w:p>
-      <w:pPr>
-        <w:spacing w:line="360" w:lineRule="auto"/>
-        <w:jc w:val="both"/>
-        <w:rPr>
-          <w:rFonts w:ascii="Times New Roman" w:hAnsi="Times New Roman" w:cs="Times New Roman"/>
-          <w:sz w:val="24"/>
-          <w:szCs w:val="24"/>
-        </w:rPr>
-      </w:pPr>
-      <w:r>
-        <w:rPr>
-          <w:rFonts w:ascii="Times New Roman" w:hAnsi="Times New Roman" w:cs="Times New Roman"/>
-          <w:sz w:val="24"/>
-          <w:szCs w:val="24"/>
-        </w:rPr>
-        <w:t>W pracy przyjęto podział zbioru na podzbiory treningowy i testowy zgodny z protokołem inter-patient zaproponowanym</w:t>
-      </w:r>
-      <w:r>
-        <w:rPr>
-          <w:rFonts w:ascii="Times New Roman" w:hAnsi="Times New Roman" w:cs="Times New Roman"/>
-          <w:sz w:val="24"/>
-          <w:szCs w:val="24"/>
-        </w:rPr>
-        <w:t xml:space="preserve"> </w:t>
-      </w:r>
-      <w:r>
-        <w:rPr>
-          <w:rFonts w:ascii="Times New Roman" w:hAnsi="Times New Roman" w:cs="Times New Roman"/>
-          <w:sz w:val="24"/>
-          <w:szCs w:val="24"/>
-        </w:rPr>
-        <w:t>przez de Chazala i in. [</w:t>
+          <w:sz w:val="24"/>
+          <w:szCs w:val="24"/>
+        </w:rPr>
+      </w:pPr>
+      <w:r>
+        <w:rPr>
+          <w:rFonts w:ascii="Times New Roman" w:hAnsi="Times New Roman" w:cs="Times New Roman"/>
+          <w:sz w:val="24"/>
+          <w:szCs w:val="24"/>
+        </w:rPr>
+        <w:t>W pracy przyjęto podział zbioru na podzbiory treningowy i testowy zgodny z protokołem inter-patient zaproponowanym przez de Chazala i in. [</w:t>
       </w:r>
       <w:r>
         <w:rPr>
@@ -5805,16 +5467,7 @@
           <w:sz w:val="24"/>
           <w:szCs w:val="24"/>
         </w:rPr>
-        <w:t xml:space="preserve">] oraz rekomendowanym przez standard </w:t>
-      </w:r>
-      <w:r>
-        <w:rPr>
-          <w:rFonts w:ascii="Times New Roman" w:hAnsi="Times New Roman" w:cs="Times New Roman"/>
-          <w:sz w:val="24"/>
-          <w:szCs w:val="24"/>
-        </w:rPr>
-        <w:lastRenderedPageBreak/>
-        <w:t>AAMI EC57</w:t>
+        <w:t>] oraz rekomendowanym przez standard AAMI EC57</w:t>
       </w:r>
       <w:r>
         <w:rPr>
@@ -5830,39 +5483,7 @@
           <w:sz w:val="24"/>
           <w:szCs w:val="24"/>
         </w:rPr>
-        <w:t>. Podział ten stanowi metodologicznie rygorystyczną alternatywę dla losowego podziału próbek, ponieważ zapobiega wyciekowi informacji pomiędzy danymi</w:t>
-      </w:r>
-      <w:r>
-        <w:rPr>
-          <w:rFonts w:ascii="Times New Roman" w:hAnsi="Times New Roman" w:cs="Times New Roman"/>
-          <w:sz w:val="24"/>
-          <w:szCs w:val="24"/>
-        </w:rPr>
-        <w:t xml:space="preserve"> </w:t>
-      </w:r>
-      <w:r>
-        <w:rPr>
-          <w:rFonts w:ascii="Times New Roman" w:hAnsi="Times New Roman" w:cs="Times New Roman"/>
-          <w:sz w:val="24"/>
-          <w:szCs w:val="24"/>
-        </w:rPr>
-        <w:t xml:space="preserve"> treningowymi a testowymi</w:t>
-      </w:r>
-      <w:r>
-        <w:rPr>
-          <w:rFonts w:ascii="Times New Roman" w:hAnsi="Times New Roman" w:cs="Times New Roman"/>
-          <w:sz w:val="24"/>
-          <w:szCs w:val="24"/>
-        </w:rPr>
-        <w:t>,</w:t>
-      </w:r>
-      <w:r>
-        <w:rPr>
-          <w:rFonts w:ascii="Times New Roman" w:hAnsi="Times New Roman" w:cs="Times New Roman"/>
-          <w:sz w:val="24"/>
-          <w:szCs w:val="24"/>
-        </w:rPr>
-        <w:t xml:space="preserve"> model podczas testowania nie widział żadnego nagrania z pacjentów, na których był uczony.</w:t>
+        <w:t>. Podział ten stanowi metodologicznie rygorystyczną alternatywę dla losowego podziału próbek, ponieważ zapobiega wyciekowi informacji pomiędzy danymi  treningowymi a testowymi, model podczas testowania nie widział żadnego nagrania z pacjentów, na których był uczony.</w:t>
       </w:r>
       <w:r>
         <w:rPr>
@@ -6485,56 +6106,34 @@
         <w:pStyle w:val="Legenda"/>
         <w:keepNext/>
       </w:pPr>
-      <w:bookmarkStart w:id="17" w:name="_Toc226896376"/>
-      <w:r>
+      <w:bookmarkStart w:id="13" w:name="_Toc226896376"/>
+      <w:r>
+        <w:lastRenderedPageBreak/>
         <w:t xml:space="preserve">Tabela </w:t>
       </w:r>
-      <w:r>
-        <w:fldChar w:fldCharType="begin"/>
-      </w:r>
-      <w:r>
-        <w:instrText xml:space="preserve"> STYLEREF 1 \s </w:instrText>
-      </w:r>
-      <w:r>
-        <w:fldChar w:fldCharType="separate"/>
-      </w:r>
-      <w:r>
-        <w:rPr>
-          <w:noProof/>
-        </w:rPr>
-        <w:t>4</w:t>
-      </w:r>
-      <w:r>
-        <w:fldChar w:fldCharType="end"/>
-      </w:r>
+      <w:fldSimple w:instr=" STYLEREF 1 \s ">
+        <w:r>
+          <w:rPr>
+            <w:noProof/>
+          </w:rPr>
+          <w:t>4</w:t>
+        </w:r>
+      </w:fldSimple>
       <w:r>
         <w:noBreakHyphen/>
       </w:r>
-      <w:r>
-        <w:fldChar w:fldCharType="begin"/>
-      </w:r>
-      <w:r>
-        <w:instrText xml:space="preserve"> SEQ Tabela \* ARABIC \s 1 </w:instrText>
-      </w:r>
-      <w:r>
-        <w:fldChar w:fldCharType="separate"/>
-      </w:r>
-      <w:r>
-        <w:rPr>
-          <w:noProof/>
-        </w:rPr>
-        <w:t>1</w:t>
-      </w:r>
-      <w:r>
-        <w:fldChar w:fldCharType="end"/>
-      </w:r>
-      <w:r>
-        <w:t xml:space="preserve"> </w:t>
-      </w:r>
-      <w:r>
-        <w:t>Mapowanie klas pobudzeni zgodnie ze standardem AAMI EC57.</w:t>
-      </w:r>
-      <w:bookmarkEnd w:id="17"/>
+      <w:fldSimple w:instr=" SEQ Tabela \* ARABIC \s 1 ">
+        <w:r>
+          <w:rPr>
+            <w:noProof/>
+          </w:rPr>
+          <w:t>1</w:t>
+        </w:r>
+      </w:fldSimple>
+      <w:r>
+        <w:t xml:space="preserve"> Mapowanie klas pobudzeni zgodnie ze standardem AAMI EC57.</w:t>
+      </w:r>
+      <w:bookmarkEnd w:id="13"/>
     </w:p>
     <w:p>
       <w:pPr>
@@ -6551,39 +6150,7 @@
           <w:sz w:val="24"/>
           <w:szCs w:val="24"/>
         </w:rPr>
-        <w:t>W procesie uczenia wykorzystano oba dostępne kanały sygnału (Lead I oraz Lead II), co umożliwia modelowi analizę</w:t>
-      </w:r>
-      <w:r>
-        <w:rPr>
-          <w:rFonts w:ascii="Times New Roman" w:hAnsi="Times New Roman" w:cs="Times New Roman"/>
-          <w:sz w:val="24"/>
-          <w:szCs w:val="24"/>
-        </w:rPr>
-        <w:t xml:space="preserve"> </w:t>
-      </w:r>
-      <w:r>
-        <w:rPr>
-          <w:rFonts w:ascii="Times New Roman" w:hAnsi="Times New Roman" w:cs="Times New Roman"/>
-          <w:sz w:val="24"/>
-          <w:szCs w:val="24"/>
-        </w:rPr>
-        <w:t>przestrzennej morfologii pobudzenia i zwiększa skuteczność klasyfikacji arytmii o zbliżonym kształcie w pojedynczym</w:t>
-      </w:r>
-      <w:r>
-        <w:rPr>
-          <w:rFonts w:ascii="Times New Roman" w:hAnsi="Times New Roman" w:cs="Times New Roman"/>
-          <w:sz w:val="24"/>
-          <w:szCs w:val="24"/>
-        </w:rPr>
-        <w:t xml:space="preserve"> </w:t>
-      </w:r>
-      <w:r>
-        <w:rPr>
-          <w:rFonts w:ascii="Times New Roman" w:hAnsi="Times New Roman" w:cs="Times New Roman"/>
-          <w:sz w:val="24"/>
-          <w:szCs w:val="24"/>
-        </w:rPr>
-        <w:t>odprowadzeniu [X].</w:t>
+        <w:t>W procesie uczenia wykorzystano oba dostępne kanały sygnału, co umożliwia modelowi analizę przestrzennej morfologii pobudzenia i zwiększa skuteczność klasyfikacji arytmii o zbliżonym kształcie w pojedynczym odprowadzeniu [X].</w:t>
       </w:r>
     </w:p>
     <w:p>
@@ -6774,7 +6341,6 @@
               <w:sz w:val="24"/>
               <w:szCs w:val="24"/>
             </w:rPr>
-            <w:lastRenderedPageBreak/>
             <m:t xml:space="preserve">H= </m:t>
           </m:r>
           <m:f>
@@ -6987,6 +6553,7 @@
           <w:sz w:val="24"/>
           <w:szCs w:val="24"/>
         </w:rPr>
+        <w:lastRenderedPageBreak/>
         <w:t>Za próg detekcji przyjmuje się 12,5% maksymalnej wartości całkowanego sygnału. Dla każdego obszaru przekroczenia progu wybierany jest jeden lokalny maksimum, z zachowaniem minimalnego odstępu między pikami wynoszącego 200 ms (72 próbki), co odpowiada górnej granicy fizjologicznej częstości akcji serca wynoszącej około 300 uderzeń na minutę.</w:t>
       </w:r>
     </w:p>
@@ -7149,16 +6716,7 @@
           <w:sz w:val="24"/>
           <w:szCs w:val="24"/>
         </w:rPr>
-        <w:t xml:space="preserve">Naturalną cechą danych EKG jest silna dominacja klasy N (pobudzenia prawidłowe), która w bazie MIT-BIH stanowi około  75–80% wszystkich pobudzeń. Bezpośrednie trenowanie </w:t>
-      </w:r>
-      <w:r>
-        <w:rPr>
-          <w:rFonts w:ascii="Times New Roman" w:hAnsi="Times New Roman" w:cs="Times New Roman"/>
-          <w:sz w:val="24"/>
-          <w:szCs w:val="24"/>
-        </w:rPr>
-        <w:lastRenderedPageBreak/>
-        <w:t>modelu na tak niezbalansowanym zbiorze prowadzi do faworyzowania  klasy większościowej kosztem klinicznie istotnych klas arytmii (V, S, F). W celu kompensacji tego zjawiska zastosowano   metodę ważenia klas (class weighting): wagi przypisane poszczególnym klasom w funkcji straty są odwrotnie proporcjonalne do częstości ich występowania w zbiorze treningowym, obliczane jako:</w:t>
+        <w:t>Naturalną cechą danych EKG jest silna dominacja klasy N (pobudzenia prawidłowe), która w bazie MIT-BIH stanowi około  75–80% wszystkich pobudzeń. Bezpośrednie trenowanie modelu na tak niezbalansowanym zbiorze prowadzi do faworyzowania  klasy większościowej kosztem klinicznie istotnych klas arytmii (V, S, F). W celu kompensacji tego zjawiska zastosowano   metodę ważenia klas (class weighting): wagi przypisane poszczególnym klasom w funkcji straty są odwrotnie proporcjonalne do częstości ich występowania w zbiorze treningowym, obliczane jako:</w:t>
       </w:r>
       <m:oMath>
         <m:r>
@@ -7382,15 +6940,7 @@
           <w:sz w:val="24"/>
           <w:szCs w:val="24"/>
         </w:rPr>
-        <w:t>G</w:t>
-      </w:r>
-      <w:r>
-        <w:rPr>
-          <w:rFonts w:ascii="Times New Roman" w:hAnsi="Times New Roman" w:cs="Times New Roman"/>
-          <w:sz w:val="24"/>
-          <w:szCs w:val="24"/>
-        </w:rPr>
-        <w:t>dzie</w:t>
+        <w:t>Gdzie</w:t>
       </w:r>
       <w:r>
         <w:rPr>
@@ -7662,11 +7212,12 @@
       <w:pPr>
         <w:pStyle w:val="Nagwek2"/>
       </w:pPr>
-      <w:bookmarkStart w:id="18" w:name="_Toc226901296"/>
-      <w:r>
+      <w:bookmarkStart w:id="14" w:name="_Toc226901296"/>
+      <w:r>
+        <w:lastRenderedPageBreak/>
         <w:t>Architektura sieci neuronowej</w:t>
       </w:r>
-      <w:bookmarkEnd w:id="18"/>
+      <w:bookmarkEnd w:id="14"/>
     </w:p>
     <w:p>
       <w:pPr>
@@ -7684,23 +7235,7 @@
           <w:sz w:val="24"/>
           <w:szCs w:val="24"/>
         </w:rPr>
-        <w:t>Do klasyfikacji segmentów EKG zastosowano jednowymiarową konwolucyjną sieć resztkową (1D ResNet). Sieci konwolucyjne 1D są szczególnie dobrze przystosowane do analizy szeregów czasowych, ponieważ filtry konwolucyjne uczone są</w:t>
-      </w:r>
-      <w:r>
-        <w:rPr>
-          <w:rFonts w:ascii="Times New Roman" w:hAnsi="Times New Roman" w:cs="Times New Roman"/>
-          <w:sz w:val="24"/>
-          <w:szCs w:val="24"/>
-        </w:rPr>
-        <w:t xml:space="preserve"> </w:t>
-      </w:r>
-      <w:r>
-        <w:rPr>
-          <w:rFonts w:ascii="Times New Roman" w:hAnsi="Times New Roman" w:cs="Times New Roman"/>
-          <w:sz w:val="24"/>
-          <w:szCs w:val="24"/>
-        </w:rPr>
-        <w:t>bezpośrednio na surowym sygnale, wydobywając lokalne wzorce morfologiczne (kształt załamka R, nachylenie odcinka ST) bez konieczności ręcznej inżynierii cech [</w:t>
+        <w:t>Do klasyfikacji segmentów EKG zastosowano jednowymiarową konwolucyjną sieć resztkową (1D ResNet). Sieci konwolucyjne 1D są szczególnie dobrze przystosowane do analizy szeregów czasowych, ponieważ filtry konwolucyjne uczone są bezpośrednio na surowym sygnale, wydobywając lokalne wzorce morfologiczne (kształt załamka R, nachylenie odcinka ST) bez konieczności ręcznej inżynierii cech [</w:t>
       </w:r>
       <w:r>
         <w:rPr>
@@ -7824,7 +7359,6 @@
           <w:sz w:val="24"/>
           <w:szCs w:val="24"/>
         </w:rPr>
-        <w:lastRenderedPageBreak/>
         <w:t xml:space="preserve"> Blok resztkowy 1 (32 filtry, kernel 5). Dwie sploty z BatchNormalization i aktywacją ReLU, z połączeniem skracającym.</w:t>
       </w:r>
       <w:r>
@@ -7982,6 +7516,7 @@
           <w:sz w:val="24"/>
           <w:szCs w:val="24"/>
         </w:rPr>
+        <w:lastRenderedPageBreak/>
         <w:t xml:space="preserve"> Blok resztkowy 4 (256 filtrów, kernel 3, dylatacja ×2). Modeluje globalny kontekst rytmu serca</w:t>
       </w:r>
       <w:r>
@@ -8078,7 +7613,7 @@
       <w:pPr>
         <w:pStyle w:val="Nagwek2"/>
       </w:pPr>
-      <w:bookmarkStart w:id="19" w:name="_Toc226901297"/>
+      <w:bookmarkStart w:id="15" w:name="_Toc226901297"/>
       <w:r>
         <w:t>Proces trenowania</w:t>
       </w:r>
@@ -8088,7 +7623,7 @@
       <w:r>
         <w:t>- przygotowanie danych treningowych, funkcje straty i optymalizatory</w:t>
       </w:r>
-      <w:bookmarkEnd w:id="19"/>
+      <w:bookmarkEnd w:id="15"/>
     </w:p>
     <w:p>
       <w:pPr>
@@ -8138,16 +7673,7 @@
           <w:sz w:val="24"/>
           <w:szCs w:val="24"/>
         </w:rPr>
-        <w:t xml:space="preserve">gwarantuje reprodukowalność </w:t>
-      </w:r>
-      <w:r>
-        <w:rPr>
-          <w:rFonts w:ascii="Times New Roman" w:hAnsi="Times New Roman" w:cs="Times New Roman"/>
-          <w:sz w:val="24"/>
-          <w:szCs w:val="24"/>
-        </w:rPr>
-        <w:lastRenderedPageBreak/>
-        <w:t>eksperymentu. Normalizacja realizowana jest metodą Z-score obliczoną wyłącznie na danych treningowych DS1:</w:t>
+        <w:t>gwarantuje reprodukowalność eksperymentu. Normalizacja realizowana jest metodą Z-score obliczoną wyłącznie na danych treningowych DS1:</w:t>
       </w:r>
     </w:p>
     <w:p>
@@ -8369,23 +7895,8 @@
           <w:sz w:val="24"/>
           <w:szCs w:val="24"/>
         </w:rPr>
-        <w:t>EarlyStopping (cierpliwość = 12 epok)</w:t>
-      </w:r>
-      <w:r>
-        <w:rPr>
-          <w:rFonts w:ascii="Times New Roman" w:hAnsi="Times New Roman" w:cs="Times New Roman"/>
-          <w:sz w:val="24"/>
-          <w:szCs w:val="24"/>
-        </w:rPr>
-        <w:t>,</w:t>
-      </w:r>
-      <w:r>
-        <w:rPr>
-          <w:rFonts w:ascii="Times New Roman" w:hAnsi="Times New Roman" w:cs="Times New Roman"/>
-          <w:sz w:val="24"/>
-          <w:szCs w:val="24"/>
-        </w:rPr>
-        <w:t xml:space="preserve"> przerywa trening, gdy strata walidacyjna nie poprawia się przez 12 kolejnych epok, i przywraca wagi odpowiadające najlepszej epoce. Mechanizm chroni przed przetrenowaniem przy jednoczesnym  pełnym wykorzystaniu pojemności modelu.</w:t>
+        <w:lastRenderedPageBreak/>
+        <w:t>EarlyStopping (cierpliwość = 12 epok), przerywa trening, gdy strata walidacyjna nie poprawia się przez 12 kolejnych epok, i przywraca wagi odpowiadające najlepszej epoce. Mechanizm chroni przed przetrenowaniem przy jednoczesnym  pełnym wykorzystaniu pojemności modelu.</w:t>
       </w:r>
     </w:p>
     <w:p>
@@ -8409,23 +7920,7 @@
           <w:sz w:val="24"/>
           <w:szCs w:val="24"/>
         </w:rPr>
-        <w:t>ReduceLROnPlateau (współczynnik = 0,5, cierpliwość = 5 epok)</w:t>
-      </w:r>
-      <w:r>
-        <w:rPr>
-          <w:rFonts w:ascii="Times New Roman" w:hAnsi="Times New Roman" w:cs="Times New Roman"/>
-          <w:sz w:val="24"/>
-          <w:szCs w:val="24"/>
-        </w:rPr>
-        <w:t xml:space="preserve">, </w:t>
-      </w:r>
-      <w:r>
-        <w:rPr>
-          <w:rFonts w:ascii="Times New Roman" w:hAnsi="Times New Roman" w:cs="Times New Roman"/>
-          <w:sz w:val="24"/>
-          <w:szCs w:val="24"/>
-        </w:rPr>
-        <w:t>zmniejsza współczynnik uczenia o połowę, gdy strata  walidacyjna stagnuje. Pozwala to na precyzyjniejsze dopasowanie w okolicach minimum funkcji straty.</w:t>
+        <w:t>ReduceLROnPlateau (współczynnik = 0,5, cierpliwość = 5 epok), zmniejsza współczynnik uczenia o połowę, gdy strata  walidacyjna stagnuje. Pozwala to na precyzyjniejsze dopasowanie w okolicach minimum funkcji straty.</w:t>
       </w:r>
     </w:p>
     <w:p>
@@ -8449,23 +7944,7 @@
           <w:sz w:val="24"/>
           <w:szCs w:val="24"/>
         </w:rPr>
-        <w:t>ModelCheckpoint</w:t>
-      </w:r>
-      <w:r>
-        <w:rPr>
-          <w:rFonts w:ascii="Times New Roman" w:hAnsi="Times New Roman" w:cs="Times New Roman"/>
-          <w:sz w:val="24"/>
-          <w:szCs w:val="24"/>
-        </w:rPr>
-        <w:t>,</w:t>
-      </w:r>
-      <w:r>
-        <w:rPr>
-          <w:rFonts w:ascii="Times New Roman" w:hAnsi="Times New Roman" w:cs="Times New Roman"/>
-          <w:sz w:val="24"/>
-          <w:szCs w:val="24"/>
-        </w:rPr>
-        <w:t xml:space="preserve"> zapisuje wagi modelu odpowiadające epoce z najniższą stratą walidacyjną, niezależnie od momentu  zakończenia treningu.</w:t>
+        <w:t>ModelCheckpoint, zapisuje wagi modelu odpowiadające epoce z najniższą stratą walidacyjną, niezależnie od momentu  zakończenia treningu.</w:t>
       </w:r>
     </w:p>
     <w:p>
@@ -8583,15 +8062,7 @@
           <w:sz w:val="24"/>
           <w:szCs w:val="24"/>
         </w:rPr>
-        <w:t>F1-score per klas</w:t>
-      </w:r>
-      <w:r>
-        <w:rPr>
-          <w:rFonts w:ascii="Times New Roman" w:hAnsi="Times New Roman" w:cs="Times New Roman"/>
-          <w:sz w:val="24"/>
-          <w:szCs w:val="24"/>
-        </w:rPr>
-        <w:t>a</w:t>
+        <w:t>F1-score per klasa</w:t>
       </w:r>
       <w:r>
         <w:rPr>
@@ -8607,15 +8078,7 @@
           <w:sz w:val="24"/>
           <w:szCs w:val="24"/>
         </w:rPr>
-        <w:t xml:space="preserve"> </w:t>
-      </w:r>
-      <w:r>
-        <w:rPr>
-          <w:rFonts w:ascii="Times New Roman" w:hAnsi="Times New Roman" w:cs="Times New Roman"/>
-          <w:sz w:val="24"/>
-          <w:szCs w:val="24"/>
-        </w:rPr>
-        <w:t xml:space="preserve"> harmoniczna średnia precyzji i czułości dla każdej z 5 klas AAMI; szczególnie istotna dla klas  rzadkich (S, V, F, Q),</w:t>
+        <w:t xml:space="preserve">  harmoniczna średnia precyzji i czułości dla każdej z 5 klas AAMI; szczególnie istotna dla klas  rzadkich (S, V, F, Q),</w:t>
       </w:r>
     </w:p>
     <w:p>
@@ -8639,35 +8102,35 @@
           <w:sz w:val="24"/>
           <w:szCs w:val="24"/>
         </w:rPr>
+        <w:t>Macierz pomyłek</w:t>
+      </w:r>
+      <w:r>
+        <w:rPr>
+          <w:rFonts w:ascii="Times New Roman" w:hAnsi="Times New Roman" w:cs="Times New Roman"/>
+          <w:sz w:val="24"/>
+          <w:szCs w:val="24"/>
+        </w:rPr>
+        <w:t>:</w:t>
+      </w:r>
+      <w:r>
+        <w:rPr>
+          <w:rFonts w:ascii="Times New Roman" w:hAnsi="Times New Roman" w:cs="Times New Roman"/>
+          <w:sz w:val="24"/>
+          <w:szCs w:val="24"/>
+        </w:rPr>
+        <w:t xml:space="preserve"> szczegółowy rozkład błędów klasyfikacji pomiędzy klasami.</w:t>
+      </w:r>
+    </w:p>
+    <w:p>
+      <w:pPr>
+        <w:pStyle w:val="Nagwek2"/>
+      </w:pPr>
+      <w:bookmarkStart w:id="16" w:name="_Toc226901298"/>
+      <w:r>
         <w:lastRenderedPageBreak/>
-        <w:t>Macierz pomyłek</w:t>
-      </w:r>
-      <w:r>
-        <w:rPr>
-          <w:rFonts w:ascii="Times New Roman" w:hAnsi="Times New Roman" w:cs="Times New Roman"/>
-          <w:sz w:val="24"/>
-          <w:szCs w:val="24"/>
-        </w:rPr>
-        <w:t>:</w:t>
-      </w:r>
-      <w:r>
-        <w:rPr>
-          <w:rFonts w:ascii="Times New Roman" w:hAnsi="Times New Roman" w:cs="Times New Roman"/>
-          <w:sz w:val="24"/>
-          <w:szCs w:val="24"/>
-        </w:rPr>
-        <w:t xml:space="preserve"> szczegółowy rozkład błędów klasyfikacji pomiędzy klasami.</w:t>
-      </w:r>
-    </w:p>
-    <w:p>
-      <w:pPr>
-        <w:pStyle w:val="Nagwek2"/>
-      </w:pPr>
-      <w:bookmarkStart w:id="20" w:name="_Toc226901298"/>
-      <w:r>
         <w:t>Wyniki ewaluacji</w:t>
       </w:r>
-      <w:bookmarkEnd w:id="20"/>
+      <w:bookmarkEnd w:id="16"/>
     </w:p>
     <w:p>
       <w:r>
@@ -8721,7 +8184,7 @@
           <w:noProof/>
         </w:rPr>
         <w:drawing>
-          <wp:inline distT="0" distB="0" distL="0" distR="0" wp14:anchorId="09BECDE1" wp14:editId="347B64A6">
+          <wp:inline distT="0" distB="0" distL="0" distR="0" wp14:anchorId="09BECDE1" wp14:editId="7007598E">
             <wp:extent cx="5760720" cy="1920240"/>
             <wp:effectExtent l="0" t="0" r="0" b="3810"/>
             <wp:docPr id="1190755232" name="Obraz 2"/>
@@ -8779,57 +8242,57 @@
       <w:pPr>
         <w:pStyle w:val="Nagwek1"/>
       </w:pPr>
-      <w:bookmarkStart w:id="21" w:name="_Toc226901299"/>
+      <w:bookmarkStart w:id="17" w:name="_Toc226901299"/>
+      <w:r>
+        <w:t>Realizacja systemu w czasie rzeczywistym</w:t>
+      </w:r>
+      <w:bookmarkEnd w:id="17"/>
+    </w:p>
+    <w:p>
+      <w:pPr>
+        <w:pStyle w:val="Nagwek2"/>
+      </w:pPr>
+      <w:bookmarkStart w:id="18" w:name="_Toc226901300"/>
+      <w:r>
+        <w:t>Emulacja urządzenia</w:t>
+      </w:r>
+      <w:bookmarkEnd w:id="18"/>
+    </w:p>
+    <w:p>
+      <w:r>
+        <w:t>opisać producent.py: wczytanie MIT-BIH, serializacja JSON, wysyłka z tempem 1/fs</w:t>
+      </w:r>
+    </w:p>
+    <w:p>
+      <w:pPr>
+        <w:pStyle w:val="Nagwek2"/>
+      </w:pPr>
+      <w:bookmarkStart w:id="19" w:name="_Toc226901301"/>
       <w:r>
         <w:lastRenderedPageBreak/>
-        <w:t>Realizacja systemu w czasie rzeczywistym</w:t>
-      </w:r>
-      <w:bookmarkEnd w:id="21"/>
+        <w:t>Konsumpcja i analiza strumieniowa</w:t>
+      </w:r>
+      <w:bookmarkEnd w:id="19"/>
+    </w:p>
+    <w:p>
+      <w:r>
+        <w:t>opisać konsument.py: bufor kołowy 8s, uruchamianie Pan-Tompkinsa co 50 próbek,</w:t>
+      </w:r>
+    </w:p>
+    <w:p>
+      <w:r>
+        <w:t xml:space="preserve">   okres refrakcji, normalizacja inferencji</w:t>
+      </w:r>
     </w:p>
     <w:p>
       <w:pPr>
         <w:pStyle w:val="Nagwek2"/>
       </w:pPr>
-      <w:bookmarkStart w:id="22" w:name="_Toc226901300"/>
-      <w:r>
-        <w:t>Emulacja urządzenia</w:t>
-      </w:r>
-      <w:bookmarkEnd w:id="22"/>
-    </w:p>
-    <w:p>
-      <w:r>
-        <w:t>opisać producent.py: wczytanie MIT-BIH, serializacja JSON, wysyłka z tempem 1/fs</w:t>
-      </w:r>
-    </w:p>
-    <w:p>
-      <w:pPr>
-        <w:pStyle w:val="Nagwek2"/>
-      </w:pPr>
-      <w:bookmarkStart w:id="23" w:name="_Toc226901301"/>
-      <w:r>
-        <w:t>Konsumpcja i analiza strumieniowa</w:t>
-      </w:r>
-      <w:bookmarkEnd w:id="23"/>
-    </w:p>
-    <w:p>
-      <w:r>
-        <w:t>opisać konsument.py: bufor kołowy 8s, uruchamianie Pan-Tompkinsa co 50 próbek,</w:t>
-      </w:r>
-    </w:p>
-    <w:p>
-      <w:r>
-        <w:t xml:space="preserve">   okres refrakcji, normalizacja inferencji</w:t>
-      </w:r>
-    </w:p>
-    <w:p>
-      <w:pPr>
-        <w:pStyle w:val="Nagwek2"/>
-      </w:pPr>
-      <w:bookmarkStart w:id="24" w:name="_Toc226901302"/>
+      <w:bookmarkStart w:id="20" w:name="_Toc226901302"/>
       <w:r>
         <w:t>Monitoring i wizualizacja</w:t>
       </w:r>
-      <w:bookmarkEnd w:id="24"/>
+      <w:bookmarkEnd w:id="20"/>
     </w:p>
     <w:p>
       <w:r>
@@ -8855,11 +8318,11 @@
       <w:pPr>
         <w:pStyle w:val="Nagwek1"/>
       </w:pPr>
-      <w:bookmarkStart w:id="25" w:name="_Toc226901303"/>
+      <w:bookmarkStart w:id="21" w:name="_Toc226901303"/>
       <w:r>
         <w:t>Podsumowanie i wnioski</w:t>
       </w:r>
-      <w:bookmarkEnd w:id="25"/>
+      <w:bookmarkEnd w:id="21"/>
     </w:p>
     <w:p>
       <w:pPr>
@@ -8906,11 +8369,11 @@
       <w:pPr>
         <w:pStyle w:val="Nagwek1"/>
       </w:pPr>
-      <w:bookmarkStart w:id="26" w:name="_Toc226901304"/>
+      <w:bookmarkStart w:id="22" w:name="_Toc226901304"/>
       <w:r>
         <w:t>Źródła</w:t>
       </w:r>
-      <w:bookmarkEnd w:id="26"/>
+      <w:bookmarkEnd w:id="22"/>
       <w:r>
         <w:t xml:space="preserve"> </w:t>
       </w:r>
@@ -9292,7 +8755,6 @@
           <w:szCs w:val="24"/>
           <w:lang w:val="en-US" w:eastAsia="pl-PL"/>
         </w:rPr>
-        <w:lastRenderedPageBreak/>
         <w:t xml:space="preserve">[6] </w:t>
       </w:r>
       <w:r>
@@ -9376,7 +8838,18 @@
             <w:szCs w:val="24"/>
             <w:lang w:val="en-US" w:eastAsia="pl-PL"/>
           </w:rPr>
-          <w:t>EuroEco (European Health Economic Trial on Home Monitoring in ICD Patients): A Provider Perspective in Five European Countries on Costs and Net Financial Impact of Follow-Up With or Without Remote Monitoring.</w:t>
+          <w:t xml:space="preserve">EuroEco (European Health Economic Trial on Home Monitoring in ICD Patients): A Provider Perspective in Five European Countries on Costs and Net Financial Impact of </w:t>
+        </w:r>
+        <w:r>
+          <w:rPr>
+            <w:rStyle w:val="Hipercze"/>
+            <w:rFonts w:ascii="Times New Roman" w:hAnsi="Times New Roman" w:cs="Times New Roman"/>
+            <w:sz w:val="24"/>
+            <w:szCs w:val="24"/>
+            <w:lang w:val="en-US" w:eastAsia="pl-PL"/>
+          </w:rPr>
+          <w:lastRenderedPageBreak/>
+          <w:t>Follow-Up With or Without Remote Monitoring.</w:t>
         </w:r>
       </w:hyperlink>
       <w:r>
@@ -9934,6 +9407,7 @@
           <w:rFonts w:ascii="Times New Roman" w:hAnsi="Times New Roman" w:cs="Times New Roman"/>
           <w:sz w:val="24"/>
           <w:szCs w:val="24"/>
+          <w:lang w:val="en-US"/>
         </w:rPr>
       </w:pPr>
       <w:r>
@@ -9943,7 +9417,6 @@
           <w:szCs w:val="24"/>
           <w:lang w:val="en-GB"/>
         </w:rPr>
-        <w:lastRenderedPageBreak/>
         <w:t>[18]</w:t>
       </w:r>
       <w:r>
@@ -9960,6 +9433,7 @@
           <w:rFonts w:ascii="Times New Roman" w:hAnsi="Times New Roman" w:cs="Times New Roman"/>
           <w:sz w:val="24"/>
           <w:szCs w:val="24"/>
+          <w:lang w:val="en-US"/>
         </w:rPr>
         <w:t>AAMI EC57</w:t>
       </w:r>
@@ -9992,14 +9466,6 @@
           <w:lang w:val="en-US"/>
         </w:rPr>
         <w:tab/>
-      </w:r>
-      <w:r>
-        <w:rPr>
-          <w:rFonts w:ascii="Times New Roman" w:hAnsi="Times New Roman" w:cs="Times New Roman"/>
-          <w:sz w:val="24"/>
-          <w:szCs w:val="24"/>
-          <w:lang w:val="en-US"/>
-        </w:rPr>
         <w:t>He K. et al. 2016, Deep Residual Learning for Image Recognition, CVPR</w:t>
       </w:r>
     </w:p>
@@ -10087,6 +9553,7 @@
           <w:rFonts w:ascii="Times New Roman" w:hAnsi="Times New Roman" w:cs="Times New Roman"/>
           <w:lang w:val="en-GB"/>
         </w:rPr>
+        <w:lastRenderedPageBreak/>
         <w:t xml:space="preserve">Frontiers in Digital Health (2025): </w:t>
       </w:r>
       <w:r>
@@ -10302,11 +9769,11 @@
       <w:pPr>
         <w:pStyle w:val="Nagwek1"/>
       </w:pPr>
-      <w:bookmarkStart w:id="27" w:name="_Toc226901305"/>
+      <w:bookmarkStart w:id="23" w:name="_Toc226901305"/>
       <w:r>
         <w:t>Spis rysunków</w:t>
       </w:r>
-      <w:bookmarkEnd w:id="27"/>
+      <w:bookmarkEnd w:id="23"/>
     </w:p>
     <w:p>
       <w:pPr>
@@ -10406,11 +9873,11 @@
       <w:pPr>
         <w:pStyle w:val="Nagwek1"/>
       </w:pPr>
-      <w:bookmarkStart w:id="28" w:name="_Toc226901306"/>
+      <w:bookmarkStart w:id="24" w:name="_Toc226901306"/>
       <w:r>
         <w:t>Spis tabel</w:t>
       </w:r>
-      <w:bookmarkEnd w:id="28"/>
+      <w:bookmarkEnd w:id="24"/>
     </w:p>
     <w:p>
       <w:pPr>
@@ -10518,71 +9985,7 @@
 
 <file path=word/comments.xml><?xml version="1.0" encoding="utf-8"?>
 <w:comments xmlns:wpc="http://schemas.microsoft.com/office/word/2010/wordprocessingCanvas" xmlns:cx="http://schemas.microsoft.com/office/drawing/2014/chartex" xmlns:cx1="http://schemas.microsoft.com/office/drawing/2015/9/8/chartex" xmlns:cx2="http://schemas.microsoft.com/office/drawing/2015/10/21/chartex" xmlns:cx3="http://schemas.microsoft.com/office/drawing/2016/5/9/chartex" xmlns:cx4="http://schemas.microsoft.com/office/drawing/2016/5/10/chartex" xmlns:cx5="http://schemas.microsoft.com/office/drawing/2016/5/11/chartex" xmlns:cx6="http://schemas.microsoft.com/office/drawing/2016/5/12/chartex" xmlns:cx7="http://schemas.microsoft.com/office/drawing/2016/5/13/chartex" xmlns:cx8="http://schemas.microsoft.com/office/drawing/2016/5/14/chartex" xmlns:mc="http://schemas.openxmlformats.org/markup-compatibility/2006" xmlns:aink="http://schemas.microsoft.com/office/drawing/2016/ink" xmlns:am3d="http://schemas.microsoft.com/office/drawing/2017/model3d" xmlns:o="urn:schemas-microsoft-com:office:office" xmlns:oel="http://schemas.microsoft.com/office/2019/extlst" xmlns:r="http://schemas.openxmlformats.org/officeDocument/2006/relationships" xmlns:m="http://schemas.openxmlformats.org/officeDocument/2006/math" xmlns:v="urn:schemas-microsoft-com:vml" xmlns:wp14="http://schemas.microsoft.com/office/word/2010/wordprocessingDrawing" xmlns:wp="http://schemas.openxmlformats.org/drawingml/2006/wordprocessingDrawing" xmlns:w10="urn:schemas-microsoft-com:office:word" xmlns:w="http://schemas.openxmlformats.org/wordprocessingml/2006/main" xmlns:w14="http://schemas.microsoft.com/office/word/2010/wordml" xmlns:w15="http://schemas.microsoft.com/office/word/2012/wordml" xmlns:w16cex="http://schemas.microsoft.com/office/word/2018/wordml/cex" xmlns:w16cid="http://schemas.microsoft.com/office/word/2016/wordml/cid" xmlns:w16="http://schemas.microsoft.com/office/word/2018/wordml" xmlns:w16du="http://schemas.microsoft.com/office/word/2023/wordml/word16du" xmlns:w16sdtdh="http://schemas.microsoft.com/office/word/2020/wordml/sdtdatahash" xmlns:w16sdtfl="http://schemas.microsoft.com/office/word/2024/wordml/sdtformatlock" xmlns:w16se="http://schemas.microsoft.com/office/word/2015/wordml/symex" xmlns:wpg="http://schemas.microsoft.com/office/word/2010/wordprocessingGroup" xmlns:wpi="http://schemas.microsoft.com/office/word/2010/wordprocessingInk" xmlns:wne="http://schemas.microsoft.com/office/word/2006/wordml" xmlns:wps="http://schemas.microsoft.com/office/word/2010/wordprocessingShape" mc:Ignorable="w14 w15 w16se w16cid w16 w16cex w16sdtdh w16sdtfl w16du wp14">
-  <w:comment w:id="3" w:author="Justyna Weber" w:date="2026-04-09T20:39:00Z" w:initials="JW">
-    <w:p>
-      <w:pPr>
-        <w:pStyle w:val="Tekstkomentarza"/>
-      </w:pPr>
-      <w:r>
-        <w:rPr>
-          <w:rStyle w:val="Odwoaniedokomentarza"/>
-        </w:rPr>
-        <w:annotationRef/>
-      </w:r>
-      <w:r>
-        <w:t>???</w:t>
-      </w:r>
-    </w:p>
-  </w:comment>
-  <w:comment w:id="4" w:author="Justyna Weber" w:date="2026-04-09T20:35:00Z" w:initials="JW">
-    <w:p>
-      <w:pPr>
-        <w:pStyle w:val="Tekstkomentarza"/>
-      </w:pPr>
-      <w:r>
-        <w:rPr>
-          <w:rStyle w:val="Odwoaniedokomentarza"/>
-        </w:rPr>
-        <w:annotationRef/>
-      </w:r>
-      <w:r>
-        <w:t xml:space="preserve">Do zmiany </w:t>
-      </w:r>
-    </w:p>
-  </w:comment>
-  <w:comment w:id="7" w:author="Justyna Weber" w:date="2026-04-09T22:18:00Z" w:initials="JW">
-    <w:p>
-      <w:pPr>
-        <w:pStyle w:val="Tekstkomentarza"/>
-      </w:pPr>
-      <w:r>
-        <w:rPr>
-          <w:rStyle w:val="Odwoaniedokomentarza"/>
-        </w:rPr>
-        <w:annotationRef/>
-      </w:r>
-      <w:r>
-        <w:t>Akapit z pracy inż. Przypisy tak samo jak w pracy. Cytować jako pracę inz?</w:t>
-      </w:r>
-    </w:p>
-  </w:comment>
-  <w:comment w:id="9" w:author="Justyna Weber" w:date="2026-04-12T12:54:00Z" w:initials="JW">
-    <w:p>
-      <w:pPr>
-        <w:pStyle w:val="Tekstkomentarza"/>
-      </w:pPr>
-      <w:r>
-        <w:rPr>
-          <w:rStyle w:val="Odwoaniedokomentarza"/>
-        </w:rPr>
-        <w:annotationRef/>
-      </w:r>
-      <w:r>
-        <w:t>Na podstawie którego artykułu to napisałam??????????</w:t>
-      </w:r>
-    </w:p>
-  </w:comment>
-  <w:comment w:id="13" w:author="Justyna Weber" w:date="2026-04-12T14:06:00Z" w:initials="JW">
+  <w:comment w:id="9" w:author="Justyna Weber" w:date="2026-04-12T14:06:00Z" w:initials="JW">
     <w:p>
       <w:pPr>
         <w:pStyle w:val="Tekstkomentarza"/>
@@ -10603,30 +10006,18 @@
 
 <file path=word/commentsExtended.xml><?xml version="1.0" encoding="utf-8"?>
 <w15:commentsEx xmlns:wpc="http://schemas.microsoft.com/office/word/2010/wordprocessingCanvas" xmlns:cx="http://schemas.microsoft.com/office/drawing/2014/chartex" xmlns:cx1="http://schemas.microsoft.com/office/drawing/2015/9/8/chartex" xmlns:cx2="http://schemas.microsoft.com/office/drawing/2015/10/21/chartex" xmlns:cx3="http://schemas.microsoft.com/office/drawing/2016/5/9/chartex" xmlns:cx4="http://schemas.microsoft.com/office/drawing/2016/5/10/chartex" xmlns:cx5="http://schemas.microsoft.com/office/drawing/2016/5/11/chartex" xmlns:cx6="http://schemas.microsoft.com/office/drawing/2016/5/12/chartex" xmlns:cx7="http://schemas.microsoft.com/office/drawing/2016/5/13/chartex" xmlns:cx8="http://schemas.microsoft.com/office/drawing/2016/5/14/chartex" xmlns:mc="http://schemas.openxmlformats.org/markup-compatibility/2006" xmlns:aink="http://schemas.microsoft.com/office/drawing/2016/ink" xmlns:am3d="http://schemas.microsoft.com/office/drawing/2017/model3d" xmlns:o="urn:schemas-microsoft-com:office:office" xmlns:oel="http://schemas.microsoft.com/office/2019/extlst" xmlns:r="http://schemas.openxmlformats.org/officeDocument/2006/relationships" xmlns:m="http://schemas.openxmlformats.org/officeDocument/2006/math" xmlns:v="urn:schemas-microsoft-com:vml" xmlns:wp14="http://schemas.microsoft.com/office/word/2010/wordprocessingDrawing" xmlns:wp="http://schemas.openxmlformats.org/drawingml/2006/wordprocessingDrawing" xmlns:w10="urn:schemas-microsoft-com:office:word" xmlns:w="http://schemas.openxmlformats.org/wordprocessingml/2006/main" xmlns:w14="http://schemas.microsoft.com/office/word/2010/wordml" xmlns:w15="http://schemas.microsoft.com/office/word/2012/wordml" xmlns:w16cex="http://schemas.microsoft.com/office/word/2018/wordml/cex" xmlns:w16cid="http://schemas.microsoft.com/office/word/2016/wordml/cid" xmlns:w16="http://schemas.microsoft.com/office/word/2018/wordml" xmlns:w16du="http://schemas.microsoft.com/office/word/2023/wordml/word16du" xmlns:w16sdtdh="http://schemas.microsoft.com/office/word/2020/wordml/sdtdatahash" xmlns:w16sdtfl="http://schemas.microsoft.com/office/word/2024/wordml/sdtformatlock" xmlns:w16se="http://schemas.microsoft.com/office/word/2015/wordml/symex" xmlns:wpg="http://schemas.microsoft.com/office/word/2010/wordprocessingGroup" xmlns:wpi="http://schemas.microsoft.com/office/word/2010/wordprocessingInk" xmlns:wne="http://schemas.microsoft.com/office/word/2006/wordml" xmlns:wps="http://schemas.microsoft.com/office/word/2010/wordprocessingShape" mc:Ignorable="w14 w15 w16se w16cid w16 w16cex w16sdtdh w16sdtfl w16du wp14">
-  <w15:commentEx w15:paraId="224898CD" w15:done="0"/>
-  <w15:commentEx w15:paraId="0A6D7626" w15:done="0"/>
-  <w15:commentEx w15:paraId="542A7151" w15:done="0"/>
-  <w15:commentEx w15:paraId="589D18DC" w15:done="0"/>
   <w15:commentEx w15:paraId="12CBC74E" w15:done="0"/>
 </w15:commentsEx>
 </file>
 
 <file path=word/commentsExtensible.xml><?xml version="1.0" encoding="utf-8"?>
 <w16cex:commentsExtensible xmlns:wpc="http://schemas.microsoft.com/office/word/2010/wordprocessingCanvas" xmlns:cx="http://schemas.microsoft.com/office/drawing/2014/chartex" xmlns:cx1="http://schemas.microsoft.com/office/drawing/2015/9/8/chartex" xmlns:cx2="http://schemas.microsoft.com/office/drawing/2015/10/21/chartex" xmlns:cx3="http://schemas.microsoft.com/office/drawing/2016/5/9/chartex" xmlns:cx4="http://schemas.microsoft.com/office/drawing/2016/5/10/chartex" xmlns:cx5="http://schemas.microsoft.com/office/drawing/2016/5/11/chartex" xmlns:cx6="http://schemas.microsoft.com/office/drawing/2016/5/12/chartex" xmlns:cx7="http://schemas.microsoft.com/office/drawing/2016/5/13/chartex" xmlns:cx8="http://schemas.microsoft.com/office/drawing/2016/5/14/chartex" xmlns:cr="http://schemas.microsoft.com/office/comments/2020/reactions" xmlns:mc="http://schemas.openxmlformats.org/markup-compatibility/2006" xmlns:aink="http://schemas.microsoft.com/office/drawing/2016/ink" xmlns:am3d="http://schemas.microsoft.com/office/drawing/2017/model3d" xmlns:o="urn:schemas-microsoft-com:office:office" xmlns:oel="http://schemas.microsoft.com/office/2019/extlst" xmlns:r="http://schemas.openxmlformats.org/officeDocument/2006/relationships" xmlns:m="http://schemas.openxmlformats.org/officeDocument/2006/math" xmlns:v="urn:schemas-microsoft-com:vml" xmlns:wp14="http://schemas.microsoft.com/office/word/2010/wordprocessingDrawing" xmlns:wp="http://schemas.openxmlformats.org/drawingml/2006/wordprocessingDrawing" xmlns:w10="urn:schemas-microsoft-com:office:word" xmlns:w="http://schemas.openxmlformats.org/wordprocessingml/2006/main" xmlns:w14="http://schemas.microsoft.com/office/word/2010/wordml" xmlns:w15="http://schemas.microsoft.com/office/word/2012/wordml" xmlns:w16cex="http://schemas.microsoft.com/office/word/2018/wordml/cex" xmlns:w16cid="http://schemas.microsoft.com/office/word/2016/wordml/cid" xmlns:w16="http://schemas.microsoft.com/office/word/2018/wordml" xmlns:w16du="http://schemas.microsoft.com/office/word/2023/wordml/word16du" xmlns:w16sdtdh="http://schemas.microsoft.com/office/word/2020/wordml/sdtdatahash" xmlns:w16sdtfl="http://schemas.microsoft.com/office/word/2024/wordml/sdtformatlock" xmlns:w16se="http://schemas.microsoft.com/office/word/2015/wordml/symex" xmlns:wpg="http://schemas.microsoft.com/office/word/2010/wordprocessingGroup" xmlns:wpi="http://schemas.microsoft.com/office/word/2010/wordprocessingInk" xmlns:wne="http://schemas.microsoft.com/office/word/2006/wordml" xmlns:wps="http://schemas.microsoft.com/office/word/2010/wordprocessingShape" mc:Ignorable="w14 w15 w16se w16cid w16 w16cex w16sdtdh w16sdtfl cr w16du wp14">
-  <w16cex:commentExtensible w16cex:durableId="00DB4107" w16cex:dateUtc="2026-04-09T18:39:00Z"/>
-  <w16cex:commentExtensible w16cex:durableId="0C41E0E2" w16cex:dateUtc="2026-04-09T18:35:00Z"/>
-  <w16cex:commentExtensible w16cex:durableId="561C08C8" w16cex:dateUtc="2026-04-09T20:18:00Z"/>
-  <w16cex:commentExtensible w16cex:durableId="44466AF1" w16cex:dateUtc="2026-04-12T10:54:00Z"/>
   <w16cex:commentExtensible w16cex:durableId="600A4411" w16cex:dateUtc="2026-04-12T12:06:00Z"/>
 </w16cex:commentsExtensible>
 </file>
 
 <file path=word/commentsIds.xml><?xml version="1.0" encoding="utf-8"?>
 <w16cid:commentsIds xmlns:wpc="http://schemas.microsoft.com/office/word/2010/wordprocessingCanvas" xmlns:cx="http://schemas.microsoft.com/office/drawing/2014/chartex" xmlns:cx1="http://schemas.microsoft.com/office/drawing/2015/9/8/chartex" xmlns:cx2="http://schemas.microsoft.com/office/drawing/2015/10/21/chartex" xmlns:cx3="http://schemas.microsoft.com/office/drawing/2016/5/9/chartex" xmlns:cx4="http://schemas.microsoft.com/office/drawing/2016/5/10/chartex" xmlns:cx5="http://schemas.microsoft.com/office/drawing/2016/5/11/chartex" xmlns:cx6="http://schemas.microsoft.com/office/drawing/2016/5/12/chartex" xmlns:cx7="http://schemas.microsoft.com/office/drawing/2016/5/13/chartex" xmlns:cx8="http://schemas.microsoft.com/office/drawing/2016/5/14/chartex" xmlns:mc="http://schemas.openxmlformats.org/markup-compatibility/2006" xmlns:aink="http://schemas.microsoft.com/office/drawing/2016/ink" xmlns:am3d="http://schemas.microsoft.com/office/drawing/2017/model3d" xmlns:o="urn:schemas-microsoft-com:office:office" xmlns:oel="http://schemas.microsoft.com/office/2019/extlst" xmlns:r="http://schemas.openxmlformats.org/officeDocument/2006/relationships" xmlns:m="http://schemas.openxmlformats.org/officeDocument/2006/math" xmlns:v="urn:schemas-microsoft-com:vml" xmlns:wp14="http://schemas.microsoft.com/office/word/2010/wordprocessingDrawing" xmlns:wp="http://schemas.openxmlformats.org/drawingml/2006/wordprocessingDrawing" xmlns:w10="urn:schemas-microsoft-com:office:word" xmlns:w="http://schemas.openxmlformats.org/wordprocessingml/2006/main" xmlns:w14="http://schemas.microsoft.com/office/word/2010/wordml" xmlns:w15="http://schemas.microsoft.com/office/word/2012/wordml" xmlns:w16cex="http://schemas.microsoft.com/office/word/2018/wordml/cex" xmlns:w16cid="http://schemas.microsoft.com/office/word/2016/wordml/cid" xmlns:w16="http://schemas.microsoft.com/office/word/2018/wordml" xmlns:w16du="http://schemas.microsoft.com/office/word/2023/wordml/word16du" xmlns:w16sdtdh="http://schemas.microsoft.com/office/word/2020/wordml/sdtdatahash" xmlns:w16sdtfl="http://schemas.microsoft.com/office/word/2024/wordml/sdtformatlock" xmlns:w16se="http://schemas.microsoft.com/office/word/2015/wordml/symex" xmlns:wpg="http://schemas.microsoft.com/office/word/2010/wordprocessingGroup" xmlns:wpi="http://schemas.microsoft.com/office/word/2010/wordprocessingInk" xmlns:wne="http://schemas.microsoft.com/office/word/2006/wordml" xmlns:wps="http://schemas.microsoft.com/office/word/2010/wordprocessingShape" mc:Ignorable="w14 w15 w16se w16cid w16 w16cex w16sdtdh w16sdtfl w16du wp14">
-  <w16cid:commentId w16cid:paraId="224898CD" w16cid:durableId="00DB4107"/>
-  <w16cid:commentId w16cid:paraId="0A6D7626" w16cid:durableId="0C41E0E2"/>
-  <w16cid:commentId w16cid:paraId="542A7151" w16cid:durableId="561C08C8"/>
-  <w16cid:commentId w16cid:paraId="589D18DC" w16cid:durableId="44466AF1"/>
   <w16cid:commentId w16cid:paraId="12CBC74E" w16cid:durableId="600A4411"/>
 </w16cid:commentsIds>
 </file>
@@ -18087,6 +17478,27 @@
 </file>
 
 <file path=customXml/item1.xml><?xml version="1.0" encoding="utf-8"?>
+<b:Sources xmlns:b="http://schemas.openxmlformats.org/officeDocument/2006/bibliography" xmlns="http://schemas.openxmlformats.org/officeDocument/2006/bibliography" SelectedStyle="\APASixthEditionOfficeOnline.xsl" StyleName="APA" Version="6"/>
+</file>
+
+<file path=customXml/item2.xml><?xml version="1.0" encoding="utf-8"?>
+<p:properties xmlns:p="http://schemas.microsoft.com/office/2006/metadata/properties" xmlns:xsi="http://www.w3.org/2001/XMLSchema-instance" xmlns:pc="http://schemas.microsoft.com/office/infopath/2007/PartnerControls">
+  <documentManagement>
+    <_activity xmlns="55cbd727-b2d3-4077-9601-6f8ae785901d" xsi:nil="true"/>
+  </documentManagement>
+</p:properties>
+</file>
+
+<file path=customXml/item3.xml><?xml version="1.0" encoding="utf-8"?>
+<?mso-contentType ?>
+<FormTemplates xmlns="http://schemas.microsoft.com/sharepoint/v3/contenttype/forms">
+  <Display>DocumentLibraryForm</Display>
+  <Edit>DocumentLibraryForm</Edit>
+  <New>DocumentLibraryForm</New>
+</FormTemplates>
+</file>
+
+<file path=customXml/item4.xml><?xml version="1.0" encoding="utf-8"?>
 <ct:contentTypeSchema xmlns:ct="http://schemas.microsoft.com/office/2006/metadata/contentType" xmlns:ma="http://schemas.microsoft.com/office/2006/metadata/properties/metaAttributes" ct:_="" ma:_="" ma:contentTypeName="Dokument" ma:contentTypeID="0x0101001AB9014CD400B74099F2004DE5F09625" ma:contentTypeVersion="11" ma:contentTypeDescription="Utwórz nowy dokument." ma:contentTypeScope="" ma:versionID="ea12f72ce1a3d42905fdde0ff96e2abe">
   <xsd:schema xmlns:xsd="http://www.w3.org/2001/XMLSchema" xmlns:xs="http://www.w3.org/2001/XMLSchema" xmlns:p="http://schemas.microsoft.com/office/2006/metadata/properties" xmlns:ns3="55cbd727-b2d3-4077-9601-6f8ae785901d" targetNamespace="http://schemas.microsoft.com/office/2006/metadata/properties" ma:root="true" ma:fieldsID="9a414200933851084bc4f880fa014bbe" ns3:_="">
     <xsd:import namespace="55cbd727-b2d3-4077-9601-6f8ae785901d"/>
@@ -18274,28 +17686,33 @@
 </ct:contentTypeSchema>
 </file>
 
-<file path=customXml/item2.xml><?xml version="1.0" encoding="utf-8"?>
-<?mso-contentType ?>
-<FormTemplates xmlns="http://schemas.microsoft.com/sharepoint/v3/contenttype/forms">
-  <Display>DocumentLibraryForm</Display>
-  <Edit>DocumentLibraryForm</Edit>
-  <New>DocumentLibraryForm</New>
-</FormTemplates>
+<file path=customXml/itemProps1.xml><?xml version="1.0" encoding="utf-8"?>
+<ds:datastoreItem xmlns:ds="http://schemas.openxmlformats.org/officeDocument/2006/customXml" ds:itemID="{10AEA2A0-C596-4161-82D6-D82504EDC790}">
+  <ds:schemaRefs>
+    <ds:schemaRef ds:uri="http://schemas.openxmlformats.org/officeDocument/2006/bibliography"/>
+  </ds:schemaRefs>
+</ds:datastoreItem>
 </file>
 
-<file path=customXml/item3.xml><?xml version="1.0" encoding="utf-8"?>
-<p:properties xmlns:p="http://schemas.microsoft.com/office/2006/metadata/properties" xmlns:xsi="http://www.w3.org/2001/XMLSchema-instance" xmlns:pc="http://schemas.microsoft.com/office/infopath/2007/PartnerControls">
-  <documentManagement>
-    <_activity xmlns="55cbd727-b2d3-4077-9601-6f8ae785901d" xsi:nil="true"/>
-  </documentManagement>
-</p:properties>
+<file path=customXml/itemProps2.xml><?xml version="1.0" encoding="utf-8"?>
+<ds:datastoreItem xmlns:ds="http://schemas.openxmlformats.org/officeDocument/2006/customXml" ds:itemID="{1F89D06B-BD63-4C20-B1AF-D2600A743F76}">
+  <ds:schemaRefs>
+    <ds:schemaRef ds:uri="http://schemas.microsoft.com/office/2006/metadata/properties"/>
+    <ds:schemaRef ds:uri="http://schemas.microsoft.com/office/infopath/2007/PartnerControls"/>
+    <ds:schemaRef ds:uri="55cbd727-b2d3-4077-9601-6f8ae785901d"/>
+  </ds:schemaRefs>
+</ds:datastoreItem>
 </file>
 
-<file path=customXml/item4.xml><?xml version="1.0" encoding="utf-8"?>
-<b:Sources xmlns:b="http://schemas.openxmlformats.org/officeDocument/2006/bibliography" xmlns="http://schemas.openxmlformats.org/officeDocument/2006/bibliography" SelectedStyle="\APASixthEditionOfficeOnline.xsl" StyleName="APA" Version="6"/>
+<file path=customXml/itemProps3.xml><?xml version="1.0" encoding="utf-8"?>
+<ds:datastoreItem xmlns:ds="http://schemas.openxmlformats.org/officeDocument/2006/customXml" ds:itemID="{75D47452-D632-4C33-ACBD-A77D16E6A479}">
+  <ds:schemaRefs>
+    <ds:schemaRef ds:uri="http://schemas.microsoft.com/sharepoint/v3/contenttype/forms"/>
+  </ds:schemaRefs>
+</ds:datastoreItem>
 </file>
 
-<file path=customXml/itemProps1.xml><?xml version="1.0" encoding="utf-8"?>
+<file path=customXml/itemProps4.xml><?xml version="1.0" encoding="utf-8"?>
 <ds:datastoreItem xmlns:ds="http://schemas.openxmlformats.org/officeDocument/2006/customXml" ds:itemID="{370077E6-5ACB-48C6-A805-7E7DD78B048C}">
   <ds:schemaRefs>
     <ds:schemaRef ds:uri="http://schemas.microsoft.com/office/2006/metadata/contentType"/>
@@ -18313,32 +17730,6 @@
 </ds:datastoreItem>
 </file>
 
-<file path=customXml/itemProps2.xml><?xml version="1.0" encoding="utf-8"?>
-<ds:datastoreItem xmlns:ds="http://schemas.openxmlformats.org/officeDocument/2006/customXml" ds:itemID="{75D47452-D632-4C33-ACBD-A77D16E6A479}">
-  <ds:schemaRefs>
-    <ds:schemaRef ds:uri="http://schemas.microsoft.com/sharepoint/v3/contenttype/forms"/>
-  </ds:schemaRefs>
-</ds:datastoreItem>
-</file>
-
-<file path=customXml/itemProps3.xml><?xml version="1.0" encoding="utf-8"?>
-<ds:datastoreItem xmlns:ds="http://schemas.openxmlformats.org/officeDocument/2006/customXml" ds:itemID="{1F89D06B-BD63-4C20-B1AF-D2600A743F76}">
-  <ds:schemaRefs>
-    <ds:schemaRef ds:uri="http://schemas.microsoft.com/office/2006/metadata/properties"/>
-    <ds:schemaRef ds:uri="http://schemas.microsoft.com/office/infopath/2007/PartnerControls"/>
-    <ds:schemaRef ds:uri="55cbd727-b2d3-4077-9601-6f8ae785901d"/>
-  </ds:schemaRefs>
-</ds:datastoreItem>
-</file>
-
-<file path=customXml/itemProps4.xml><?xml version="1.0" encoding="utf-8"?>
-<ds:datastoreItem xmlns:ds="http://schemas.openxmlformats.org/officeDocument/2006/customXml" ds:itemID="{10AEA2A0-C596-4161-82D6-D82504EDC790}">
-  <ds:schemaRefs>
-    <ds:schemaRef ds:uri="http://schemas.openxmlformats.org/officeDocument/2006/bibliography"/>
-  </ds:schemaRefs>
-</ds:datastoreItem>
-</file>
-
 <file path=docMetadata/LabelInfo.xml><?xml version="1.0" encoding="utf-8"?>
 <clbl:labelList xmlns:clbl="http://schemas.microsoft.com/office/2020/mipLabelMetadata">
   <clbl:label id="{164e1b0e-c8e5-41a9-9bbb-6f7ed40eef04}" enabled="0" method="" siteId="{164e1b0e-c8e5-41a9-9bbb-6f7ed40eef04}" removed="1"/>

</xml_diff>